<commit_message>
Se agrego el documento de los Casios de uso y se actualizo el documento del Prototipo
</commit_message>
<xml_diff>
--- a/05_Prototipos_de_alta_fidelidad_e_interacciones/Documentacion-Prototipo-Sistema-Tutorias.docx
+++ b/05_Prototipos_de_alta_fidelidad_e_interacciones/Documentacion-Prototipo-Sistema-Tutorias.docx
@@ -70,9 +70,9 @@
           </wp:anchor>
         </w:drawing>
       </w:r>
-      <w:bookmarkStart w:id="0" w:name="_Toc436856824"/>
+      <w:bookmarkStart w:id="0" w:name="_Toc452014848"/>
       <w:bookmarkStart w:id="1" w:name="_Toc452014994"/>
-      <w:bookmarkStart w:id="2" w:name="_Toc452014848"/>
+      <w:bookmarkStart w:id="2" w:name="_Toc436856824"/>
     </w:p>
     <w:p>
       <w:pPr>
@@ -226,7 +226,7 @@
                         <w:txbxContent>
                           <w:p>
                             <w:pPr>
-                              <w:pStyle w:val="FrameContents"/>
+                              <w:pStyle w:val="FrameContentsuser"/>
                               <w:spacing w:before="0" w:after="160"/>
                               <w:ind w:end="11"/>
                               <w:jc w:val="center"/>
@@ -310,7 +310,7 @@
                   <w:txbxContent>
                     <w:p>
                       <w:pPr>
-                        <w:pStyle w:val="FrameContents"/>
+                        <w:pStyle w:val="FrameContentsuser"/>
                         <w:spacing w:before="0" w:after="160"/>
                         <w:ind w:end="11"/>
                         <w:jc w:val="center"/>
@@ -1241,7 +1241,27 @@
                 <w:sz w:val="21"/>
                 <w:szCs w:val="21"/>
               </w:rPr>
-              <w:t>Diseño basado en el SII+ TecNM, con adaptación básica a pantallas pequeñas.</w:t>
+              <w:t xml:space="preserve">Diseño basado en </w:t>
+            </w:r>
+            <w:r>
+              <w:rPr>
+                <w:rFonts w:eastAsia="Arial" w:cs="Arial"/>
+                <w:b w:val="false"/>
+                <w:bCs w:val="false"/>
+                <w:sz w:val="21"/>
+                <w:szCs w:val="21"/>
+              </w:rPr>
+              <w:t>colores similares a los del SII TecNM</w:t>
+            </w:r>
+            <w:r>
+              <w:rPr>
+                <w:rFonts w:eastAsia="Arial" w:cs="Arial"/>
+                <w:b w:val="false"/>
+                <w:bCs w:val="false"/>
+                <w:sz w:val="21"/>
+                <w:szCs w:val="21"/>
+              </w:rPr>
+              <w:t>, con adaptación básica a pantallas pequeñas.</w:t>
             </w:r>
           </w:p>
         </w:tc>
@@ -1340,7 +1360,9 @@
       <w:pPr>
         <w:pStyle w:val="Normal"/>
         <w:spacing w:before="0" w:after="60"/>
-        <w:rPr/>
+        <w:rPr>
+          <w:rFonts w:eastAsia="Arial" w:cs="Arial"/>
+        </w:rPr>
       </w:pPr>
       <w:r>
         <w:rPr/>
@@ -1356,13 +1378,19 @@
         <w:rPr>
           <w:rFonts w:eastAsia="Arial" w:cs="Arial"/>
         </w:rPr>
-        <w:t>4. Base visual</w:t>
-      </w:r>
-    </w:p>
-    <w:p>
-      <w:pPr>
-        <w:pStyle w:val="Normal"/>
-        <w:keepNext w:val="false"/>
+        <w:t>4</w:t>
+      </w:r>
+      <w:r>
+        <w:rPr>
+          <w:rFonts w:eastAsia="Arial" w:cs="Arial"/>
+        </w:rPr>
+        <w:t>. Descripción de las pantallas</w:t>
+      </w:r>
+    </w:p>
+    <w:p>
+      <w:pPr>
+        <w:pStyle w:val="Normal"/>
+        <w:keepNext w:val="true"/>
         <w:spacing w:lineRule="auto" w:line="360" w:before="0" w:after="160"/>
         <w:jc w:val="both"/>
         <w:rPr/>
@@ -1371,1721 +1399,7 @@
         <w:rPr>
           <w:rFonts w:eastAsia="Arial" w:cs="Arial"/>
         </w:rPr>
-        <w:t>El diseño toma como referencia el SII+ TecNM, proyecto previo del residente, para que el nuevo sistema se sienta familiar y sea coherente con el entorno institucional. Estos son los valores principales que se reutilizaron:</w:t>
-      </w:r>
-    </w:p>
-    <w:tbl>
-      <w:tblPr>
-        <w:tblW w:w="8838" w:type="dxa"/>
-        <w:jc w:val="start"/>
-        <w:tblInd w:w="0" w:type="dxa"/>
-        <w:tblLayout w:type="fixed"/>
-        <w:tblCellMar>
-          <w:top w:w="70" w:type="dxa"/>
-          <w:start w:w="110" w:type="dxa"/>
-          <w:bottom w:w="70" w:type="dxa"/>
-          <w:end w:w="110" w:type="dxa"/>
-        </w:tblCellMar>
-      </w:tblPr>
-      <w:tblGrid>
-        <w:gridCol w:w="1794"/>
-        <w:gridCol w:w="2548"/>
-        <w:gridCol w:w="4496"/>
-      </w:tblGrid>
-      <w:tr>
-        <w:trPr>
-          <w:tblHeader w:val="true"/>
-          <w:cantSplit/>
-        </w:trPr>
-        <w:tc>
-          <w:tcPr>
-            <w:tcW w:w="1794" w:type="dxa"/>
-            <w:tcBorders>
-              <w:top w:val="single" w:sz="4" w:space="0" w:color="C9D3E3"/>
-              <w:start w:val="single" w:sz="4" w:space="0" w:color="C9D3E3"/>
-              <w:bottom w:val="single" w:sz="4" w:space="0" w:color="C9D3E3"/>
-              <w:end w:val="single" w:sz="4" w:space="0" w:color="C9D3E3"/>
-            </w:tcBorders>
-            <w:shd w:color="auto" w:fill="E3EDF8" w:val="clear"/>
-          </w:tcPr>
-          <w:p>
-            <w:pPr>
-              <w:pStyle w:val="Normal"/>
-              <w:spacing w:lineRule="auto" w:line="262" w:before="0" w:after="0"/>
-              <w:rPr/>
-            </w:pPr>
-            <w:r>
-              <w:rPr>
-                <w:rFonts w:eastAsia="Arial" w:cs="Arial"/>
-                <w:b/>
-                <w:bCs/>
-                <w:sz w:val="21"/>
-                <w:szCs w:val="21"/>
-              </w:rPr>
-              <w:t>Elemento</w:t>
-            </w:r>
-          </w:p>
-        </w:tc>
-        <w:tc>
-          <w:tcPr>
-            <w:tcW w:w="2548" w:type="dxa"/>
-            <w:tcBorders>
-              <w:top w:val="single" w:sz="4" w:space="0" w:color="C9D3E3"/>
-              <w:start w:val="single" w:sz="4" w:space="0" w:color="C9D3E3"/>
-              <w:bottom w:val="single" w:sz="4" w:space="0" w:color="C9D3E3"/>
-              <w:end w:val="single" w:sz="4" w:space="0" w:color="C9D3E3"/>
-            </w:tcBorders>
-            <w:shd w:color="auto" w:fill="E3EDF8" w:val="clear"/>
-          </w:tcPr>
-          <w:p>
-            <w:pPr>
-              <w:pStyle w:val="Normal"/>
-              <w:spacing w:lineRule="auto" w:line="262" w:before="0" w:after="0"/>
-              <w:rPr/>
-            </w:pPr>
-            <w:r>
-              <w:rPr>
-                <w:rFonts w:eastAsia="Arial" w:cs="Arial"/>
-                <w:b/>
-                <w:bCs/>
-                <w:sz w:val="21"/>
-                <w:szCs w:val="21"/>
-              </w:rPr>
-              <w:t>Valor</w:t>
-            </w:r>
-          </w:p>
-        </w:tc>
-        <w:tc>
-          <w:tcPr>
-            <w:tcW w:w="4496" w:type="dxa"/>
-            <w:tcBorders>
-              <w:top w:val="single" w:sz="4" w:space="0" w:color="C9D3E3"/>
-              <w:start w:val="single" w:sz="4" w:space="0" w:color="C9D3E3"/>
-              <w:bottom w:val="single" w:sz="4" w:space="0" w:color="C9D3E3"/>
-              <w:end w:val="single" w:sz="4" w:space="0" w:color="C9D3E3"/>
-            </w:tcBorders>
-            <w:shd w:color="auto" w:fill="E3EDF8" w:val="clear"/>
-          </w:tcPr>
-          <w:p>
-            <w:pPr>
-              <w:pStyle w:val="Normal"/>
-              <w:spacing w:lineRule="auto" w:line="262" w:before="0" w:after="0"/>
-              <w:rPr/>
-            </w:pPr>
-            <w:r>
-              <w:rPr>
-                <w:rFonts w:eastAsia="Arial" w:cs="Arial"/>
-                <w:b/>
-                <w:bCs/>
-                <w:sz w:val="21"/>
-                <w:szCs w:val="21"/>
-              </w:rPr>
-              <w:t>Uso</w:t>
-            </w:r>
-          </w:p>
-        </w:tc>
-      </w:tr>
-      <w:tr>
-        <w:trPr>
-          <w:cantSplit/>
-        </w:trPr>
-        <w:tc>
-          <w:tcPr>
-            <w:tcW w:w="1794" w:type="dxa"/>
-            <w:tcBorders>
-              <w:top w:val="single" w:sz="4" w:space="0" w:color="C9D3E3"/>
-              <w:start w:val="single" w:sz="4" w:space="0" w:color="C9D3E3"/>
-              <w:bottom w:val="single" w:sz="4" w:space="0" w:color="C9D3E3"/>
-              <w:end w:val="single" w:sz="4" w:space="0" w:color="C9D3E3"/>
-            </w:tcBorders>
-          </w:tcPr>
-          <w:p>
-            <w:pPr>
-              <w:pStyle w:val="Normal"/>
-              <w:spacing w:lineRule="auto" w:line="262" w:before="0" w:after="0"/>
-              <w:rPr/>
-            </w:pPr>
-            <w:r>
-              <w:rPr>
-                <w:rFonts w:eastAsia="Arial" w:cs="Arial"/>
-                <w:b w:val="false"/>
-                <w:bCs w:val="false"/>
-                <w:sz w:val="21"/>
-                <w:szCs w:val="21"/>
-              </w:rPr>
-              <w:t>Azul marino</w:t>
-            </w:r>
-          </w:p>
-        </w:tc>
-        <w:tc>
-          <w:tcPr>
-            <w:tcW w:w="2548" w:type="dxa"/>
-            <w:tcBorders>
-              <w:top w:val="single" w:sz="4" w:space="0" w:color="C9D3E3"/>
-              <w:start w:val="single" w:sz="4" w:space="0" w:color="C9D3E3"/>
-              <w:bottom w:val="single" w:sz="4" w:space="0" w:color="C9D3E3"/>
-              <w:end w:val="single" w:sz="4" w:space="0" w:color="C9D3E3"/>
-            </w:tcBorders>
-          </w:tcPr>
-          <w:p>
-            <w:pPr>
-              <w:pStyle w:val="Normal"/>
-              <w:spacing w:lineRule="auto" w:line="262" w:before="0" w:after="0"/>
-              <w:rPr/>
-            </w:pPr>
-            <w:r>
-              <w:rPr>
-                <w:rFonts w:eastAsia="Arial" w:cs="Arial"/>
-                <w:b w:val="false"/>
-                <w:bCs w:val="false"/>
-                <w:sz w:val="21"/>
-                <w:szCs w:val="21"/>
-              </w:rPr>
-              <w:t>#003366</w:t>
-            </w:r>
-          </w:p>
-        </w:tc>
-        <w:tc>
-          <w:tcPr>
-            <w:tcW w:w="4496" w:type="dxa"/>
-            <w:tcBorders>
-              <w:top w:val="single" w:sz="4" w:space="0" w:color="C9D3E3"/>
-              <w:start w:val="single" w:sz="4" w:space="0" w:color="C9D3E3"/>
-              <w:bottom w:val="single" w:sz="4" w:space="0" w:color="C9D3E3"/>
-              <w:end w:val="single" w:sz="4" w:space="0" w:color="C9D3E3"/>
-            </w:tcBorders>
-          </w:tcPr>
-          <w:p>
-            <w:pPr>
-              <w:pStyle w:val="Normal"/>
-              <w:spacing w:lineRule="auto" w:line="262" w:before="0" w:after="0"/>
-              <w:rPr/>
-            </w:pPr>
-            <w:r>
-              <w:rPr>
-                <w:rFonts w:eastAsia="Arial" w:cs="Arial"/>
-                <w:b w:val="false"/>
-                <w:bCs w:val="false"/>
-                <w:sz w:val="21"/>
-                <w:szCs w:val="21"/>
-              </w:rPr>
-              <w:t>Color principal: botones, títulos y barra de navegación.</w:t>
-            </w:r>
-          </w:p>
-        </w:tc>
-      </w:tr>
-      <w:tr>
-        <w:trPr>
-          <w:cantSplit/>
-        </w:trPr>
-        <w:tc>
-          <w:tcPr>
-            <w:tcW w:w="1794" w:type="dxa"/>
-            <w:tcBorders>
-              <w:top w:val="single" w:sz="4" w:space="0" w:color="C9D3E3"/>
-              <w:start w:val="single" w:sz="4" w:space="0" w:color="C9D3E3"/>
-              <w:bottom w:val="single" w:sz="4" w:space="0" w:color="C9D3E3"/>
-              <w:end w:val="single" w:sz="4" w:space="0" w:color="C9D3E3"/>
-            </w:tcBorders>
-          </w:tcPr>
-          <w:p>
-            <w:pPr>
-              <w:pStyle w:val="Normal"/>
-              <w:spacing w:lineRule="auto" w:line="262" w:before="0" w:after="0"/>
-              <w:rPr/>
-            </w:pPr>
-            <w:r>
-              <w:rPr>
-                <w:rFonts w:eastAsia="Arial" w:cs="Arial"/>
-                <w:b w:val="false"/>
-                <w:bCs w:val="false"/>
-                <w:sz w:val="21"/>
-                <w:szCs w:val="21"/>
-              </w:rPr>
-              <w:t>Azul institucional</w:t>
-            </w:r>
-          </w:p>
-        </w:tc>
-        <w:tc>
-          <w:tcPr>
-            <w:tcW w:w="2548" w:type="dxa"/>
-            <w:tcBorders>
-              <w:top w:val="single" w:sz="4" w:space="0" w:color="C9D3E3"/>
-              <w:start w:val="single" w:sz="4" w:space="0" w:color="C9D3E3"/>
-              <w:bottom w:val="single" w:sz="4" w:space="0" w:color="C9D3E3"/>
-              <w:end w:val="single" w:sz="4" w:space="0" w:color="C9D3E3"/>
-            </w:tcBorders>
-          </w:tcPr>
-          <w:p>
-            <w:pPr>
-              <w:pStyle w:val="Normal"/>
-              <w:spacing w:lineRule="auto" w:line="262" w:before="0" w:after="0"/>
-              <w:rPr/>
-            </w:pPr>
-            <w:r>
-              <w:rPr>
-                <w:rFonts w:eastAsia="Arial" w:cs="Arial"/>
-                <w:b w:val="false"/>
-                <w:bCs w:val="false"/>
-                <w:sz w:val="21"/>
-                <w:szCs w:val="21"/>
-              </w:rPr>
-              <w:t>#000080</w:t>
-            </w:r>
-          </w:p>
-        </w:tc>
-        <w:tc>
-          <w:tcPr>
-            <w:tcW w:w="4496" w:type="dxa"/>
-            <w:tcBorders>
-              <w:top w:val="single" w:sz="4" w:space="0" w:color="C9D3E3"/>
-              <w:start w:val="single" w:sz="4" w:space="0" w:color="C9D3E3"/>
-              <w:bottom w:val="single" w:sz="4" w:space="0" w:color="C9D3E3"/>
-              <w:end w:val="single" w:sz="4" w:space="0" w:color="C9D3E3"/>
-            </w:tcBorders>
-          </w:tcPr>
-          <w:p>
-            <w:pPr>
-              <w:pStyle w:val="Normal"/>
-              <w:spacing w:lineRule="auto" w:line="262" w:before="0" w:after="0"/>
-              <w:rPr/>
-            </w:pPr>
-            <w:r>
-              <w:rPr>
-                <w:rFonts w:eastAsia="Arial" w:cs="Arial"/>
-                <w:b w:val="false"/>
-                <w:bCs w:val="false"/>
-                <w:sz w:val="21"/>
-                <w:szCs w:val="21"/>
-              </w:rPr>
-              <w:t>Título de la barra institucional del inicio de sesión.</w:t>
-            </w:r>
-          </w:p>
-        </w:tc>
-      </w:tr>
-      <w:tr>
-        <w:trPr>
-          <w:cantSplit/>
-        </w:trPr>
-        <w:tc>
-          <w:tcPr>
-            <w:tcW w:w="1794" w:type="dxa"/>
-            <w:tcBorders>
-              <w:top w:val="single" w:sz="4" w:space="0" w:color="C9D3E3"/>
-              <w:start w:val="single" w:sz="4" w:space="0" w:color="C9D3E3"/>
-              <w:bottom w:val="single" w:sz="4" w:space="0" w:color="C9D3E3"/>
-              <w:end w:val="single" w:sz="4" w:space="0" w:color="C9D3E3"/>
-            </w:tcBorders>
-          </w:tcPr>
-          <w:p>
-            <w:pPr>
-              <w:pStyle w:val="Normal"/>
-              <w:spacing w:lineRule="auto" w:line="262" w:before="0" w:after="0"/>
-              <w:rPr/>
-            </w:pPr>
-            <w:r>
-              <w:rPr>
-                <w:rFonts w:eastAsia="Arial" w:cs="Arial"/>
-                <w:b w:val="false"/>
-                <w:bCs w:val="false"/>
-                <w:sz w:val="21"/>
-                <w:szCs w:val="21"/>
-              </w:rPr>
-              <w:t>Gris de fondo</w:t>
-            </w:r>
-          </w:p>
-        </w:tc>
-        <w:tc>
-          <w:tcPr>
-            <w:tcW w:w="2548" w:type="dxa"/>
-            <w:tcBorders>
-              <w:top w:val="single" w:sz="4" w:space="0" w:color="C9D3E3"/>
-              <w:start w:val="single" w:sz="4" w:space="0" w:color="C9D3E3"/>
-              <w:bottom w:val="single" w:sz="4" w:space="0" w:color="C9D3E3"/>
-              <w:end w:val="single" w:sz="4" w:space="0" w:color="C9D3E3"/>
-            </w:tcBorders>
-          </w:tcPr>
-          <w:p>
-            <w:pPr>
-              <w:pStyle w:val="Normal"/>
-              <w:spacing w:lineRule="auto" w:line="262" w:before="0" w:after="0"/>
-              <w:rPr/>
-            </w:pPr>
-            <w:r>
-              <w:rPr>
-                <w:rFonts w:eastAsia="Arial" w:cs="Arial"/>
-                <w:b w:val="false"/>
-                <w:bCs w:val="false"/>
-                <w:sz w:val="21"/>
-                <w:szCs w:val="21"/>
-              </w:rPr>
-              <w:t>#F3F4F6 / #F8FAFC</w:t>
-            </w:r>
-          </w:p>
-        </w:tc>
-        <w:tc>
-          <w:tcPr>
-            <w:tcW w:w="4496" w:type="dxa"/>
-            <w:tcBorders>
-              <w:top w:val="single" w:sz="4" w:space="0" w:color="C9D3E3"/>
-              <w:start w:val="single" w:sz="4" w:space="0" w:color="C9D3E3"/>
-              <w:bottom w:val="single" w:sz="4" w:space="0" w:color="C9D3E3"/>
-              <w:end w:val="single" w:sz="4" w:space="0" w:color="C9D3E3"/>
-            </w:tcBorders>
-          </w:tcPr>
-          <w:p>
-            <w:pPr>
-              <w:pStyle w:val="Normal"/>
-              <w:spacing w:lineRule="auto" w:line="262" w:before="0" w:after="0"/>
-              <w:rPr/>
-            </w:pPr>
-            <w:r>
-              <w:rPr>
-                <w:rFonts w:eastAsia="Arial" w:cs="Arial"/>
-                <w:b w:val="false"/>
-                <w:bCs w:val="false"/>
-                <w:sz w:val="21"/>
-                <w:szCs w:val="21"/>
-              </w:rPr>
-              <w:t>Fondo del inicio de sesión / fondo de las pantallas internas.</w:t>
-            </w:r>
-          </w:p>
-        </w:tc>
-      </w:tr>
-      <w:tr>
-        <w:trPr>
-          <w:cantSplit/>
-        </w:trPr>
-        <w:tc>
-          <w:tcPr>
-            <w:tcW w:w="1794" w:type="dxa"/>
-            <w:tcBorders>
-              <w:top w:val="single" w:sz="4" w:space="0" w:color="C9D3E3"/>
-              <w:start w:val="single" w:sz="4" w:space="0" w:color="C9D3E3"/>
-              <w:bottom w:val="single" w:sz="4" w:space="0" w:color="C9D3E3"/>
-              <w:end w:val="single" w:sz="4" w:space="0" w:color="C9D3E3"/>
-            </w:tcBorders>
-          </w:tcPr>
-          <w:p>
-            <w:pPr>
-              <w:pStyle w:val="Normal"/>
-              <w:spacing w:lineRule="auto" w:line="262" w:before="0" w:after="0"/>
-              <w:rPr/>
-            </w:pPr>
-            <w:r>
-              <w:rPr>
-                <w:rFonts w:eastAsia="Arial" w:cs="Arial"/>
-                <w:b w:val="false"/>
-                <w:bCs w:val="false"/>
-                <w:sz w:val="21"/>
-                <w:szCs w:val="21"/>
-              </w:rPr>
-              <w:t>Gris institucional</w:t>
-            </w:r>
-          </w:p>
-        </w:tc>
-        <w:tc>
-          <w:tcPr>
-            <w:tcW w:w="2548" w:type="dxa"/>
-            <w:tcBorders>
-              <w:top w:val="single" w:sz="4" w:space="0" w:color="C9D3E3"/>
-              <w:start w:val="single" w:sz="4" w:space="0" w:color="C9D3E3"/>
-              <w:bottom w:val="single" w:sz="4" w:space="0" w:color="C9D3E3"/>
-              <w:end w:val="single" w:sz="4" w:space="0" w:color="C9D3E3"/>
-            </w:tcBorders>
-          </w:tcPr>
-          <w:p>
-            <w:pPr>
-              <w:pStyle w:val="Normal"/>
-              <w:spacing w:lineRule="auto" w:line="262" w:before="0" w:after="0"/>
-              <w:rPr/>
-            </w:pPr>
-            <w:r>
-              <w:rPr>
-                <w:rFonts w:eastAsia="Arial" w:cs="Arial"/>
-                <w:b w:val="false"/>
-                <w:bCs w:val="false"/>
-                <w:sz w:val="21"/>
-                <w:szCs w:val="21"/>
-              </w:rPr>
-              <w:t>#CCCCCC (barra), #E0E0E0 (pie)</w:t>
-            </w:r>
-          </w:p>
-        </w:tc>
-        <w:tc>
-          <w:tcPr>
-            <w:tcW w:w="4496" w:type="dxa"/>
-            <w:tcBorders>
-              <w:top w:val="single" w:sz="4" w:space="0" w:color="C9D3E3"/>
-              <w:start w:val="single" w:sz="4" w:space="0" w:color="C9D3E3"/>
-              <w:bottom w:val="single" w:sz="4" w:space="0" w:color="C9D3E3"/>
-              <w:end w:val="single" w:sz="4" w:space="0" w:color="C9D3E3"/>
-            </w:tcBorders>
-          </w:tcPr>
-          <w:p>
-            <w:pPr>
-              <w:pStyle w:val="Normal"/>
-              <w:spacing w:lineRule="auto" w:line="262" w:before="0" w:after="0"/>
-              <w:rPr/>
-            </w:pPr>
-            <w:r>
-              <w:rPr>
-                <w:rFonts w:eastAsia="Arial" w:cs="Arial"/>
-                <w:b w:val="false"/>
-                <w:bCs w:val="false"/>
-                <w:sz w:val="21"/>
-                <w:szCs w:val="21"/>
-              </w:rPr>
-              <w:t>Barra superior con logos y pie de página.</w:t>
-            </w:r>
-          </w:p>
-        </w:tc>
-      </w:tr>
-      <w:tr>
-        <w:trPr>
-          <w:cantSplit/>
-        </w:trPr>
-        <w:tc>
-          <w:tcPr>
-            <w:tcW w:w="1794" w:type="dxa"/>
-            <w:tcBorders>
-              <w:top w:val="single" w:sz="4" w:space="0" w:color="C9D3E3"/>
-              <w:start w:val="single" w:sz="4" w:space="0" w:color="C9D3E3"/>
-              <w:bottom w:val="single" w:sz="4" w:space="0" w:color="C9D3E3"/>
-              <w:end w:val="single" w:sz="4" w:space="0" w:color="C9D3E3"/>
-            </w:tcBorders>
-          </w:tcPr>
-          <w:p>
-            <w:pPr>
-              <w:pStyle w:val="Normal"/>
-              <w:spacing w:lineRule="auto" w:line="262" w:before="0" w:after="0"/>
-              <w:rPr/>
-            </w:pPr>
-            <w:r>
-              <w:rPr>
-                <w:rFonts w:eastAsia="Arial" w:cs="Arial"/>
-                <w:b w:val="false"/>
-                <w:bCs w:val="false"/>
-                <w:sz w:val="21"/>
-                <w:szCs w:val="21"/>
-              </w:rPr>
-              <w:t>Naranja</w:t>
-            </w:r>
-          </w:p>
-        </w:tc>
-        <w:tc>
-          <w:tcPr>
-            <w:tcW w:w="2548" w:type="dxa"/>
-            <w:tcBorders>
-              <w:top w:val="single" w:sz="4" w:space="0" w:color="C9D3E3"/>
-              <w:start w:val="single" w:sz="4" w:space="0" w:color="C9D3E3"/>
-              <w:bottom w:val="single" w:sz="4" w:space="0" w:color="C9D3E3"/>
-              <w:end w:val="single" w:sz="4" w:space="0" w:color="C9D3E3"/>
-            </w:tcBorders>
-          </w:tcPr>
-          <w:p>
-            <w:pPr>
-              <w:pStyle w:val="Normal"/>
-              <w:spacing w:lineRule="auto" w:line="262" w:before="0" w:after="0"/>
-              <w:rPr/>
-            </w:pPr>
-            <w:r>
-              <w:rPr>
-                <w:rFonts w:eastAsia="Arial" w:cs="Arial"/>
-                <w:b w:val="false"/>
-                <w:bCs w:val="false"/>
-                <w:sz w:val="21"/>
-                <w:szCs w:val="21"/>
-              </w:rPr>
-              <w:t>#FFAB40</w:t>
-            </w:r>
-          </w:p>
-        </w:tc>
-        <w:tc>
-          <w:tcPr>
-            <w:tcW w:w="4496" w:type="dxa"/>
-            <w:tcBorders>
-              <w:top w:val="single" w:sz="4" w:space="0" w:color="C9D3E3"/>
-              <w:start w:val="single" w:sz="4" w:space="0" w:color="C9D3E3"/>
-              <w:bottom w:val="single" w:sz="4" w:space="0" w:color="C9D3E3"/>
-              <w:end w:val="single" w:sz="4" w:space="0" w:color="C9D3E3"/>
-            </w:tcBorders>
-          </w:tcPr>
-          <w:p>
-            <w:pPr>
-              <w:pStyle w:val="Normal"/>
-              <w:spacing w:lineRule="auto" w:line="262" w:before="0" w:after="0"/>
-              <w:rPr/>
-            </w:pPr>
-            <w:r>
-              <w:rPr>
-                <w:rFonts w:eastAsia="Arial" w:cs="Arial"/>
-                <w:b w:val="false"/>
-                <w:bCs w:val="false"/>
-                <w:sz w:val="21"/>
-                <w:szCs w:val="21"/>
-              </w:rPr>
-              <w:t>Pestaña activa de la barra de navegación.</w:t>
-            </w:r>
-          </w:p>
-        </w:tc>
-      </w:tr>
-      <w:tr>
-        <w:trPr>
-          <w:cantSplit/>
-        </w:trPr>
-        <w:tc>
-          <w:tcPr>
-            <w:tcW w:w="1794" w:type="dxa"/>
-            <w:tcBorders>
-              <w:top w:val="single" w:sz="4" w:space="0" w:color="C9D3E3"/>
-              <w:start w:val="single" w:sz="4" w:space="0" w:color="C9D3E3"/>
-              <w:bottom w:val="single" w:sz="4" w:space="0" w:color="C9D3E3"/>
-              <w:end w:val="single" w:sz="4" w:space="0" w:color="C9D3E3"/>
-            </w:tcBorders>
-          </w:tcPr>
-          <w:p>
-            <w:pPr>
-              <w:pStyle w:val="Normal"/>
-              <w:spacing w:lineRule="auto" w:line="262" w:before="0" w:after="0"/>
-              <w:rPr/>
-            </w:pPr>
-            <w:r>
-              <w:rPr>
-                <w:rFonts w:eastAsia="Arial" w:cs="Arial"/>
-                <w:b w:val="false"/>
-                <w:bCs w:val="false"/>
-                <w:sz w:val="21"/>
-                <w:szCs w:val="21"/>
-              </w:rPr>
-              <w:t>Rojo</w:t>
-            </w:r>
-          </w:p>
-        </w:tc>
-        <w:tc>
-          <w:tcPr>
-            <w:tcW w:w="2548" w:type="dxa"/>
-            <w:tcBorders>
-              <w:top w:val="single" w:sz="4" w:space="0" w:color="C9D3E3"/>
-              <w:start w:val="single" w:sz="4" w:space="0" w:color="C9D3E3"/>
-              <w:bottom w:val="single" w:sz="4" w:space="0" w:color="C9D3E3"/>
-              <w:end w:val="single" w:sz="4" w:space="0" w:color="C9D3E3"/>
-            </w:tcBorders>
-          </w:tcPr>
-          <w:p>
-            <w:pPr>
-              <w:pStyle w:val="Normal"/>
-              <w:spacing w:lineRule="auto" w:line="262" w:before="0" w:after="0"/>
-              <w:rPr/>
-            </w:pPr>
-            <w:r>
-              <w:rPr>
-                <w:rFonts w:eastAsia="Arial" w:cs="Arial"/>
-                <w:b w:val="false"/>
-                <w:bCs w:val="false"/>
-                <w:sz w:val="21"/>
-                <w:szCs w:val="21"/>
-              </w:rPr>
-              <w:t>#FF5252</w:t>
-            </w:r>
-          </w:p>
-        </w:tc>
-        <w:tc>
-          <w:tcPr>
-            <w:tcW w:w="4496" w:type="dxa"/>
-            <w:tcBorders>
-              <w:top w:val="single" w:sz="4" w:space="0" w:color="C9D3E3"/>
-              <w:start w:val="single" w:sz="4" w:space="0" w:color="C9D3E3"/>
-              <w:bottom w:val="single" w:sz="4" w:space="0" w:color="C9D3E3"/>
-              <w:end w:val="single" w:sz="4" w:space="0" w:color="C9D3E3"/>
-            </w:tcBorders>
-          </w:tcPr>
-          <w:p>
-            <w:pPr>
-              <w:pStyle w:val="Normal"/>
-              <w:spacing w:lineRule="auto" w:line="262" w:before="0" w:after="0"/>
-              <w:rPr/>
-            </w:pPr>
-            <w:r>
-              <w:rPr>
-                <w:rFonts w:eastAsia="Arial" w:cs="Arial"/>
-                <w:b w:val="false"/>
-                <w:bCs w:val="false"/>
-                <w:sz w:val="21"/>
-                <w:szCs w:val="21"/>
-              </w:rPr>
-              <w:t>Botón de cerrar sesión.</w:t>
-            </w:r>
-          </w:p>
-        </w:tc>
-      </w:tr>
-      <w:tr>
-        <w:trPr>
-          <w:cantSplit/>
-        </w:trPr>
-        <w:tc>
-          <w:tcPr>
-            <w:tcW w:w="1794" w:type="dxa"/>
-            <w:tcBorders>
-              <w:top w:val="single" w:sz="4" w:space="0" w:color="C9D3E3"/>
-              <w:start w:val="single" w:sz="4" w:space="0" w:color="C9D3E3"/>
-              <w:bottom w:val="single" w:sz="4" w:space="0" w:color="C9D3E3"/>
-              <w:end w:val="single" w:sz="4" w:space="0" w:color="C9D3E3"/>
-            </w:tcBorders>
-          </w:tcPr>
-          <w:p>
-            <w:pPr>
-              <w:pStyle w:val="Normal"/>
-              <w:spacing w:lineRule="auto" w:line="262" w:before="0" w:after="0"/>
-              <w:rPr/>
-            </w:pPr>
-            <w:r>
-              <w:rPr>
-                <w:rFonts w:eastAsia="Arial" w:cs="Arial"/>
-                <w:b w:val="false"/>
-                <w:bCs w:val="false"/>
-                <w:sz w:val="21"/>
-                <w:szCs w:val="21"/>
-              </w:rPr>
-              <w:t>Etiquetas de estado</w:t>
-            </w:r>
-          </w:p>
-        </w:tc>
-        <w:tc>
-          <w:tcPr>
-            <w:tcW w:w="2548" w:type="dxa"/>
-            <w:tcBorders>
-              <w:top w:val="single" w:sz="4" w:space="0" w:color="C9D3E3"/>
-              <w:start w:val="single" w:sz="4" w:space="0" w:color="C9D3E3"/>
-              <w:bottom w:val="single" w:sz="4" w:space="0" w:color="C9D3E3"/>
-              <w:end w:val="single" w:sz="4" w:space="0" w:color="C9D3E3"/>
-            </w:tcBorders>
-          </w:tcPr>
-          <w:p>
-            <w:pPr>
-              <w:pStyle w:val="Normal"/>
-              <w:spacing w:lineRule="auto" w:line="262" w:before="0" w:after="0"/>
-              <w:rPr/>
-            </w:pPr>
-            <w:r>
-              <w:rPr>
-                <w:rFonts w:eastAsia="Arial" w:cs="Arial"/>
-                <w:b w:val="false"/>
-                <w:bCs w:val="false"/>
-                <w:sz w:val="21"/>
-                <w:szCs w:val="21"/>
-              </w:rPr>
-              <w:t>Rojo, naranja, verde, azul y gris</w:t>
-            </w:r>
-          </w:p>
-        </w:tc>
-        <w:tc>
-          <w:tcPr>
-            <w:tcW w:w="4496" w:type="dxa"/>
-            <w:tcBorders>
-              <w:top w:val="single" w:sz="4" w:space="0" w:color="C9D3E3"/>
-              <w:start w:val="single" w:sz="4" w:space="0" w:color="C9D3E3"/>
-              <w:bottom w:val="single" w:sz="4" w:space="0" w:color="C9D3E3"/>
-              <w:end w:val="single" w:sz="4" w:space="0" w:color="C9D3E3"/>
-            </w:tcBorders>
-          </w:tcPr>
-          <w:p>
-            <w:pPr>
-              <w:pStyle w:val="Normal"/>
-              <w:spacing w:lineRule="auto" w:line="262" w:before="0" w:after="0"/>
-              <w:rPr/>
-            </w:pPr>
-            <w:r>
-              <w:rPr>
-                <w:rFonts w:eastAsia="Arial" w:cs="Arial"/>
-                <w:b w:val="false"/>
-                <w:bCs w:val="false"/>
-                <w:sz w:val="21"/>
-                <w:szCs w:val="21"/>
-              </w:rPr>
-              <w:t>Rojo: requiere atención. Naranja: advertencia. Verde: al corriente. Azul: canalizado. Gris: sin diagnóstico.</w:t>
-            </w:r>
-          </w:p>
-        </w:tc>
-      </w:tr>
-      <w:tr>
-        <w:trPr>
-          <w:cantSplit/>
-        </w:trPr>
-        <w:tc>
-          <w:tcPr>
-            <w:tcW w:w="1794" w:type="dxa"/>
-            <w:tcBorders>
-              <w:top w:val="single" w:sz="4" w:space="0" w:color="C9D3E3"/>
-              <w:start w:val="single" w:sz="4" w:space="0" w:color="C9D3E3"/>
-              <w:bottom w:val="single" w:sz="4" w:space="0" w:color="C9D3E3"/>
-              <w:end w:val="single" w:sz="4" w:space="0" w:color="C9D3E3"/>
-            </w:tcBorders>
-          </w:tcPr>
-          <w:p>
-            <w:pPr>
-              <w:pStyle w:val="Normal"/>
-              <w:spacing w:lineRule="auto" w:line="262" w:before="0" w:after="0"/>
-              <w:rPr/>
-            </w:pPr>
-            <w:r>
-              <w:rPr>
-                <w:rFonts w:eastAsia="Arial" w:cs="Arial"/>
-                <w:b w:val="false"/>
-                <w:bCs w:val="false"/>
-                <w:sz w:val="21"/>
-                <w:szCs w:val="21"/>
-              </w:rPr>
-              <w:t>Tipografía</w:t>
-            </w:r>
-          </w:p>
-        </w:tc>
-        <w:tc>
-          <w:tcPr>
-            <w:tcW w:w="2548" w:type="dxa"/>
-            <w:tcBorders>
-              <w:top w:val="single" w:sz="4" w:space="0" w:color="C9D3E3"/>
-              <w:start w:val="single" w:sz="4" w:space="0" w:color="C9D3E3"/>
-              <w:bottom w:val="single" w:sz="4" w:space="0" w:color="C9D3E3"/>
-              <w:end w:val="single" w:sz="4" w:space="0" w:color="C9D3E3"/>
-            </w:tcBorders>
-          </w:tcPr>
-          <w:p>
-            <w:pPr>
-              <w:pStyle w:val="Normal"/>
-              <w:spacing w:lineRule="auto" w:line="262" w:before="0" w:after="0"/>
-              <w:rPr/>
-            </w:pPr>
-            <w:r>
-              <w:rPr>
-                <w:rFonts w:eastAsia="Arial" w:cs="Arial"/>
-                <w:b w:val="false"/>
-                <w:bCs w:val="false"/>
-                <w:sz w:val="21"/>
-                <w:szCs w:val="21"/>
-              </w:rPr>
-              <w:t>Roboto / Helvetica Neue</w:t>
-            </w:r>
-          </w:p>
-        </w:tc>
-        <w:tc>
-          <w:tcPr>
-            <w:tcW w:w="4496" w:type="dxa"/>
-            <w:tcBorders>
-              <w:top w:val="single" w:sz="4" w:space="0" w:color="C9D3E3"/>
-              <w:start w:val="single" w:sz="4" w:space="0" w:color="C9D3E3"/>
-              <w:bottom w:val="single" w:sz="4" w:space="0" w:color="C9D3E3"/>
-              <w:end w:val="single" w:sz="4" w:space="0" w:color="C9D3E3"/>
-            </w:tcBorders>
-          </w:tcPr>
-          <w:p>
-            <w:pPr>
-              <w:pStyle w:val="Normal"/>
-              <w:spacing w:lineRule="auto" w:line="262" w:before="0" w:after="0"/>
-              <w:rPr/>
-            </w:pPr>
-            <w:r>
-              <w:rPr>
-                <w:rFonts w:eastAsia="Arial" w:cs="Arial"/>
-                <w:b w:val="false"/>
-                <w:bCs w:val="false"/>
-                <w:sz w:val="21"/>
-                <w:szCs w:val="21"/>
-              </w:rPr>
-              <w:t>Roboto en el cuerpo; Helvetica Neue en la barra institucional.</w:t>
-            </w:r>
-          </w:p>
-        </w:tc>
-      </w:tr>
-      <w:tr>
-        <w:trPr>
-          <w:cantSplit/>
-        </w:trPr>
-        <w:tc>
-          <w:tcPr>
-            <w:tcW w:w="1794" w:type="dxa"/>
-            <w:tcBorders>
-              <w:top w:val="single" w:sz="4" w:space="0" w:color="C9D3E3"/>
-              <w:start w:val="single" w:sz="4" w:space="0" w:color="C9D3E3"/>
-              <w:bottom w:val="single" w:sz="4" w:space="0" w:color="C9D3E3"/>
-              <w:end w:val="single" w:sz="4" w:space="0" w:color="C9D3E3"/>
-            </w:tcBorders>
-          </w:tcPr>
-          <w:p>
-            <w:pPr>
-              <w:pStyle w:val="Normal"/>
-              <w:spacing w:lineRule="auto" w:line="262" w:before="0" w:after="0"/>
-              <w:rPr/>
-            </w:pPr>
-            <w:r>
-              <w:rPr>
-                <w:rFonts w:eastAsia="Arial" w:cs="Arial"/>
-                <w:b w:val="false"/>
-                <w:bCs w:val="false"/>
-                <w:sz w:val="21"/>
-                <w:szCs w:val="21"/>
-              </w:rPr>
-              <w:t>Componentes</w:t>
-            </w:r>
-          </w:p>
-        </w:tc>
-        <w:tc>
-          <w:tcPr>
-            <w:tcW w:w="2548" w:type="dxa"/>
-            <w:tcBorders>
-              <w:top w:val="single" w:sz="4" w:space="0" w:color="C9D3E3"/>
-              <w:start w:val="single" w:sz="4" w:space="0" w:color="C9D3E3"/>
-              <w:bottom w:val="single" w:sz="4" w:space="0" w:color="C9D3E3"/>
-              <w:end w:val="single" w:sz="4" w:space="0" w:color="C9D3E3"/>
-            </w:tcBorders>
-          </w:tcPr>
-          <w:p>
-            <w:pPr>
-              <w:pStyle w:val="Normal"/>
-              <w:spacing w:lineRule="auto" w:line="262" w:before="0" w:after="0"/>
-              <w:rPr/>
-            </w:pPr>
-            <w:r>
-              <w:rPr>
-                <w:rFonts w:eastAsia="Arial" w:cs="Arial"/>
-                <w:b w:val="false"/>
-                <w:bCs w:val="false"/>
-                <w:sz w:val="21"/>
-                <w:szCs w:val="21"/>
-              </w:rPr>
-              <w:t>Tarjetas y botones</w:t>
-            </w:r>
-          </w:p>
-        </w:tc>
-        <w:tc>
-          <w:tcPr>
-            <w:tcW w:w="4496" w:type="dxa"/>
-            <w:tcBorders>
-              <w:top w:val="single" w:sz="4" w:space="0" w:color="C9D3E3"/>
-              <w:start w:val="single" w:sz="4" w:space="0" w:color="C9D3E3"/>
-              <w:bottom w:val="single" w:sz="4" w:space="0" w:color="C9D3E3"/>
-              <w:end w:val="single" w:sz="4" w:space="0" w:color="C9D3E3"/>
-            </w:tcBorders>
-          </w:tcPr>
-          <w:p>
-            <w:pPr>
-              <w:pStyle w:val="Normal"/>
-              <w:spacing w:lineRule="auto" w:line="262" w:before="0" w:after="0"/>
-              <w:rPr/>
-            </w:pPr>
-            <w:r>
-              <w:rPr>
-                <w:rFonts w:eastAsia="Arial" w:cs="Arial"/>
-                <w:b w:val="false"/>
-                <w:bCs w:val="false"/>
-                <w:sz w:val="21"/>
-                <w:szCs w:val="21"/>
-              </w:rPr>
-              <w:t>Tarjetas blancas de esquinas redondeadas, botón principal azul marino, mensajes emergentes inferiores.</w:t>
-            </w:r>
-          </w:p>
-        </w:tc>
-      </w:tr>
-    </w:tbl>
-    <w:p>
-      <w:pPr>
-        <w:pStyle w:val="Normal"/>
-        <w:spacing w:before="0" w:after="60"/>
-        <w:rPr/>
-      </w:pPr>
-      <w:r>
-        <w:rPr/>
-      </w:r>
-    </w:p>
-    <w:p>
-      <w:pPr>
-        <w:pStyle w:val="Heading1"/>
-        <w:spacing w:before="360" w:after="160"/>
-        <w:rPr/>
-      </w:pPr>
-      <w:r>
-        <w:rPr>
-          <w:rFonts w:eastAsia="Arial" w:cs="Arial"/>
-        </w:rPr>
-        <w:t>5. Fundamento de las decisiones de diseño</w:t>
-      </w:r>
-    </w:p>
-    <w:p>
-      <w:pPr>
-        <w:pStyle w:val="Normal"/>
-        <w:keepNext w:val="false"/>
-        <w:spacing w:lineRule="auto" w:line="360" w:before="0" w:after="160"/>
-        <w:jc w:val="both"/>
-        <w:rPr/>
-      </w:pPr>
-      <w:r>
-        <w:rPr>
-          <w:rFonts w:eastAsia="Arial" w:cs="Arial"/>
-        </w:rPr>
-        <w:t>Las fuentes de información hasta ahora son la entrevista a la Coordinación de Tutorías, el análisis del estado actual del PIT y las definiciones de alcance del proyecto. Las entrevistas a tutores aún no cuentan con respuestas, por lo que varias decisiones son hipótesis por validar.</w:t>
-      </w:r>
-    </w:p>
-    <w:tbl>
-      <w:tblPr>
-        <w:tblW w:w="8838" w:type="dxa"/>
-        <w:jc w:val="start"/>
-        <w:tblInd w:w="0" w:type="dxa"/>
-        <w:tblLayout w:type="fixed"/>
-        <w:tblCellMar>
-          <w:top w:w="70" w:type="dxa"/>
-          <w:start w:w="110" w:type="dxa"/>
-          <w:bottom w:w="70" w:type="dxa"/>
-          <w:end w:w="110" w:type="dxa"/>
-        </w:tblCellMar>
-      </w:tblPr>
-      <w:tblGrid>
-        <w:gridCol w:w="4626"/>
-        <w:gridCol w:w="4212"/>
-      </w:tblGrid>
-      <w:tr>
-        <w:trPr>
-          <w:tblHeader w:val="true"/>
-          <w:cantSplit/>
-        </w:trPr>
-        <w:tc>
-          <w:tcPr>
-            <w:tcW w:w="4626" w:type="dxa"/>
-            <w:tcBorders>
-              <w:top w:val="single" w:sz="4" w:space="0" w:color="C9D3E3"/>
-              <w:start w:val="single" w:sz="4" w:space="0" w:color="C9D3E3"/>
-              <w:bottom w:val="single" w:sz="4" w:space="0" w:color="C9D3E3"/>
-              <w:end w:val="single" w:sz="4" w:space="0" w:color="C9D3E3"/>
-            </w:tcBorders>
-            <w:shd w:color="auto" w:fill="E3EDF8" w:val="clear"/>
-          </w:tcPr>
-          <w:p>
-            <w:pPr>
-              <w:pStyle w:val="Normal"/>
-              <w:spacing w:lineRule="auto" w:line="262" w:before="0" w:after="0"/>
-              <w:rPr/>
-            </w:pPr>
-            <w:r>
-              <w:rPr>
-                <w:rFonts w:eastAsia="Arial" w:cs="Arial"/>
-                <w:b/>
-                <w:bCs/>
-                <w:sz w:val="21"/>
-                <w:szCs w:val="21"/>
-              </w:rPr>
-              <w:t>Decisión de diseño</w:t>
-            </w:r>
-          </w:p>
-        </w:tc>
-        <w:tc>
-          <w:tcPr>
-            <w:tcW w:w="4212" w:type="dxa"/>
-            <w:tcBorders>
-              <w:top w:val="single" w:sz="4" w:space="0" w:color="C9D3E3"/>
-              <w:start w:val="single" w:sz="4" w:space="0" w:color="C9D3E3"/>
-              <w:bottom w:val="single" w:sz="4" w:space="0" w:color="C9D3E3"/>
-              <w:end w:val="single" w:sz="4" w:space="0" w:color="C9D3E3"/>
-            </w:tcBorders>
-            <w:shd w:color="auto" w:fill="E3EDF8" w:val="clear"/>
-          </w:tcPr>
-          <w:p>
-            <w:pPr>
-              <w:pStyle w:val="Normal"/>
-              <w:spacing w:lineRule="auto" w:line="262" w:before="0" w:after="0"/>
-              <w:rPr/>
-            </w:pPr>
-            <w:r>
-              <w:rPr>
-                <w:rFonts w:eastAsia="Arial" w:cs="Arial"/>
-                <w:b/>
-                <w:bCs/>
-                <w:sz w:val="21"/>
-                <w:szCs w:val="21"/>
-              </w:rPr>
-              <w:t>Origen</w:t>
-            </w:r>
-          </w:p>
-        </w:tc>
-      </w:tr>
-      <w:tr>
-        <w:trPr>
-          <w:cantSplit/>
-        </w:trPr>
-        <w:tc>
-          <w:tcPr>
-            <w:tcW w:w="4626" w:type="dxa"/>
-            <w:tcBorders>
-              <w:top w:val="single" w:sz="4" w:space="0" w:color="C9D3E3"/>
-              <w:start w:val="single" w:sz="4" w:space="0" w:color="C9D3E3"/>
-              <w:bottom w:val="single" w:sz="4" w:space="0" w:color="C9D3E3"/>
-              <w:end w:val="single" w:sz="4" w:space="0" w:color="C9D3E3"/>
-            </w:tcBorders>
-          </w:tcPr>
-          <w:p>
-            <w:pPr>
-              <w:pStyle w:val="Normal"/>
-              <w:spacing w:lineRule="auto" w:line="262" w:before="0" w:after="0"/>
-              <w:rPr/>
-            </w:pPr>
-            <w:r>
-              <w:rPr>
-                <w:rFonts w:eastAsia="Arial" w:cs="Arial"/>
-                <w:b w:val="false"/>
-                <w:bCs w:val="false"/>
-                <w:sz w:val="21"/>
-                <w:szCs w:val="21"/>
-              </w:rPr>
-              <w:t>Expediente centralizado por estudiante, con continuidad entre tutores.</w:t>
-            </w:r>
-          </w:p>
-        </w:tc>
-        <w:tc>
-          <w:tcPr>
-            <w:tcW w:w="4212" w:type="dxa"/>
-            <w:tcBorders>
-              <w:top w:val="single" w:sz="4" w:space="0" w:color="C9D3E3"/>
-              <w:start w:val="single" w:sz="4" w:space="0" w:color="C9D3E3"/>
-              <w:bottom w:val="single" w:sz="4" w:space="0" w:color="C9D3E3"/>
-              <w:end w:val="single" w:sz="4" w:space="0" w:color="C9D3E3"/>
-            </w:tcBorders>
-          </w:tcPr>
-          <w:p>
-            <w:pPr>
-              <w:pStyle w:val="Normal"/>
-              <w:spacing w:lineRule="auto" w:line="262" w:before="0" w:after="0"/>
-              <w:rPr/>
-            </w:pPr>
-            <w:r>
-              <w:rPr>
-                <w:rFonts w:eastAsia="Arial" w:cs="Arial"/>
-                <w:b w:val="false"/>
-                <w:bCs w:val="false"/>
-                <w:sz w:val="21"/>
-                <w:szCs w:val="21"/>
-              </w:rPr>
-              <w:t>Entrevista a Coordinación; análisis del estado actual (pérdida de historial al cambiar de tutor).</w:t>
-            </w:r>
-          </w:p>
-        </w:tc>
-      </w:tr>
-      <w:tr>
-        <w:trPr>
-          <w:cantSplit/>
-        </w:trPr>
-        <w:tc>
-          <w:tcPr>
-            <w:tcW w:w="4626" w:type="dxa"/>
-            <w:tcBorders>
-              <w:top w:val="single" w:sz="4" w:space="0" w:color="C9D3E3"/>
-              <w:start w:val="single" w:sz="4" w:space="0" w:color="C9D3E3"/>
-              <w:bottom w:val="single" w:sz="4" w:space="0" w:color="C9D3E3"/>
-              <w:end w:val="single" w:sz="4" w:space="0" w:color="C9D3E3"/>
-            </w:tcBorders>
-          </w:tcPr>
-          <w:p>
-            <w:pPr>
-              <w:pStyle w:val="Normal"/>
-              <w:spacing w:lineRule="auto" w:line="262" w:before="0" w:after="0"/>
-              <w:rPr/>
-            </w:pPr>
-            <w:r>
-              <w:rPr>
-                <w:rFonts w:eastAsia="Arial" w:cs="Arial"/>
-                <w:b w:val="false"/>
-                <w:bCs w:val="false"/>
-                <w:sz w:val="21"/>
-                <w:szCs w:val="21"/>
-              </w:rPr>
-              <w:t>La ficha de identificación es la primera sección del expediente.</w:t>
-            </w:r>
-          </w:p>
-        </w:tc>
-        <w:tc>
-          <w:tcPr>
-            <w:tcW w:w="4212" w:type="dxa"/>
-            <w:tcBorders>
-              <w:top w:val="single" w:sz="4" w:space="0" w:color="C9D3E3"/>
-              <w:start w:val="single" w:sz="4" w:space="0" w:color="C9D3E3"/>
-              <w:bottom w:val="single" w:sz="4" w:space="0" w:color="C9D3E3"/>
-              <w:end w:val="single" w:sz="4" w:space="0" w:color="C9D3E3"/>
-            </w:tcBorders>
-          </w:tcPr>
-          <w:p>
-            <w:pPr>
-              <w:pStyle w:val="Normal"/>
-              <w:spacing w:lineRule="auto" w:line="262" w:before="0" w:after="0"/>
-              <w:rPr/>
-            </w:pPr>
-            <w:r>
-              <w:rPr>
-                <w:rFonts w:eastAsia="Arial" w:cs="Arial"/>
-                <w:b w:val="false"/>
-                <w:bCs w:val="false"/>
-                <w:sz w:val="21"/>
-                <w:szCs w:val="21"/>
-              </w:rPr>
-              <w:t>Entrevista a Coordinación (“debería ser el número uno”).</w:t>
-            </w:r>
-          </w:p>
-        </w:tc>
-      </w:tr>
-      <w:tr>
-        <w:trPr>
-          <w:cantSplit/>
-        </w:trPr>
-        <w:tc>
-          <w:tcPr>
-            <w:tcW w:w="4626" w:type="dxa"/>
-            <w:tcBorders>
-              <w:top w:val="single" w:sz="4" w:space="0" w:color="C9D3E3"/>
-              <w:start w:val="single" w:sz="4" w:space="0" w:color="C9D3E3"/>
-              <w:bottom w:val="single" w:sz="4" w:space="0" w:color="C9D3E3"/>
-              <w:end w:val="single" w:sz="4" w:space="0" w:color="C9D3E3"/>
-            </w:tcBorders>
-          </w:tcPr>
-          <w:p>
-            <w:pPr>
-              <w:pStyle w:val="Normal"/>
-              <w:spacing w:lineRule="auto" w:line="262" w:before="0" w:after="0"/>
-              <w:rPr/>
-            </w:pPr>
-            <w:r>
-              <w:rPr>
-                <w:rFonts w:eastAsia="Arial" w:cs="Arial"/>
-                <w:b w:val="false"/>
-                <w:bCs w:val="false"/>
-                <w:sz w:val="21"/>
-                <w:szCs w:val="21"/>
-              </w:rPr>
-              <w:t>Historial académico con kárdex, promedio y materias en rezago.</w:t>
-            </w:r>
-          </w:p>
-        </w:tc>
-        <w:tc>
-          <w:tcPr>
-            <w:tcW w:w="4212" w:type="dxa"/>
-            <w:tcBorders>
-              <w:top w:val="single" w:sz="4" w:space="0" w:color="C9D3E3"/>
-              <w:start w:val="single" w:sz="4" w:space="0" w:color="C9D3E3"/>
-              <w:bottom w:val="single" w:sz="4" w:space="0" w:color="C9D3E3"/>
-              <w:end w:val="single" w:sz="4" w:space="0" w:color="C9D3E3"/>
-            </w:tcBorders>
-          </w:tcPr>
-          <w:p>
-            <w:pPr>
-              <w:pStyle w:val="Normal"/>
-              <w:spacing w:lineRule="auto" w:line="262" w:before="0" w:after="0"/>
-              <w:rPr/>
-            </w:pPr>
-            <w:r>
-              <w:rPr>
-                <w:rFonts w:eastAsia="Arial" w:cs="Arial"/>
-                <w:b w:val="false"/>
-                <w:bCs w:val="false"/>
-                <w:sz w:val="21"/>
-                <w:szCs w:val="21"/>
-              </w:rPr>
-              <w:t>Entrevista a Coordinación.</w:t>
-            </w:r>
-          </w:p>
-        </w:tc>
-      </w:tr>
-      <w:tr>
-        <w:trPr>
-          <w:cantSplit/>
-        </w:trPr>
-        <w:tc>
-          <w:tcPr>
-            <w:tcW w:w="4626" w:type="dxa"/>
-            <w:tcBorders>
-              <w:top w:val="single" w:sz="4" w:space="0" w:color="C9D3E3"/>
-              <w:start w:val="single" w:sz="4" w:space="0" w:color="C9D3E3"/>
-              <w:bottom w:val="single" w:sz="4" w:space="0" w:color="C9D3E3"/>
-              <w:end w:val="single" w:sz="4" w:space="0" w:color="C9D3E3"/>
-            </w:tcBorders>
-          </w:tcPr>
-          <w:p>
-            <w:pPr>
-              <w:pStyle w:val="Normal"/>
-              <w:spacing w:lineRule="auto" w:line="262" w:before="0" w:after="0"/>
-              <w:rPr/>
-            </w:pPr>
-            <w:r>
-              <w:rPr>
-                <w:rFonts w:eastAsia="Arial" w:cs="Arial"/>
-                <w:b w:val="false"/>
-                <w:bCs w:val="false"/>
-                <w:sz w:val="21"/>
-                <w:szCs w:val="21"/>
-              </w:rPr>
-              <w:t>Diagnóstico con técnicas de estudio, motivación y estilos de aprendizaje.</w:t>
-            </w:r>
-          </w:p>
-        </w:tc>
-        <w:tc>
-          <w:tcPr>
-            <w:tcW w:w="4212" w:type="dxa"/>
-            <w:tcBorders>
-              <w:top w:val="single" w:sz="4" w:space="0" w:color="C9D3E3"/>
-              <w:start w:val="single" w:sz="4" w:space="0" w:color="C9D3E3"/>
-              <w:bottom w:val="single" w:sz="4" w:space="0" w:color="C9D3E3"/>
-              <w:end w:val="single" w:sz="4" w:space="0" w:color="C9D3E3"/>
-            </w:tcBorders>
-          </w:tcPr>
-          <w:p>
-            <w:pPr>
-              <w:pStyle w:val="Normal"/>
-              <w:spacing w:lineRule="auto" w:line="262" w:before="0" w:after="0"/>
-              <w:rPr/>
-            </w:pPr>
-            <w:r>
-              <w:rPr>
-                <w:rFonts w:eastAsia="Arial" w:cs="Arial"/>
-                <w:b w:val="false"/>
-                <w:bCs w:val="false"/>
-                <w:sz w:val="21"/>
-                <w:szCs w:val="21"/>
-              </w:rPr>
-              <w:t>Entrevista a Coordinación (batería de pruebas que se aplica cada semestre).</w:t>
-            </w:r>
-          </w:p>
-        </w:tc>
-      </w:tr>
-      <w:tr>
-        <w:trPr>
-          <w:cantSplit/>
-        </w:trPr>
-        <w:tc>
-          <w:tcPr>
-            <w:tcW w:w="4626" w:type="dxa"/>
-            <w:tcBorders>
-              <w:top w:val="single" w:sz="4" w:space="0" w:color="C9D3E3"/>
-              <w:start w:val="single" w:sz="4" w:space="0" w:color="C9D3E3"/>
-              <w:bottom w:val="single" w:sz="4" w:space="0" w:color="C9D3E3"/>
-              <w:end w:val="single" w:sz="4" w:space="0" w:color="C9D3E3"/>
-            </w:tcBorders>
-          </w:tcPr>
-          <w:p>
-            <w:pPr>
-              <w:pStyle w:val="Normal"/>
-              <w:spacing w:lineRule="auto" w:line="262" w:before="0" w:after="0"/>
-              <w:rPr/>
-            </w:pPr>
-            <w:r>
-              <w:rPr>
-                <w:rFonts w:eastAsia="Arial" w:cs="Arial"/>
-                <w:b w:val="false"/>
-                <w:bCs w:val="false"/>
-                <w:sz w:val="21"/>
-                <w:szCs w:val="21"/>
-              </w:rPr>
-              <w:t>Registro de apoyos recibidos (psicología, tutoría, atención par).</w:t>
-            </w:r>
-          </w:p>
-        </w:tc>
-        <w:tc>
-          <w:tcPr>
-            <w:tcW w:w="4212" w:type="dxa"/>
-            <w:tcBorders>
-              <w:top w:val="single" w:sz="4" w:space="0" w:color="C9D3E3"/>
-              <w:start w:val="single" w:sz="4" w:space="0" w:color="C9D3E3"/>
-              <w:bottom w:val="single" w:sz="4" w:space="0" w:color="C9D3E3"/>
-              <w:end w:val="single" w:sz="4" w:space="0" w:color="C9D3E3"/>
-            </w:tcBorders>
-          </w:tcPr>
-          <w:p>
-            <w:pPr>
-              <w:pStyle w:val="Normal"/>
-              <w:spacing w:lineRule="auto" w:line="262" w:before="0" w:after="0"/>
-              <w:rPr/>
-            </w:pPr>
-            <w:r>
-              <w:rPr>
-                <w:rFonts w:eastAsia="Arial" w:cs="Arial"/>
-                <w:b w:val="false"/>
-                <w:bCs w:val="false"/>
-                <w:sz w:val="21"/>
-                <w:szCs w:val="21"/>
-              </w:rPr>
-              <w:t>Entrevista a Coordinación.</w:t>
-            </w:r>
-          </w:p>
-        </w:tc>
-      </w:tr>
-      <w:tr>
-        <w:trPr>
-          <w:cantSplit/>
-        </w:trPr>
-        <w:tc>
-          <w:tcPr>
-            <w:tcW w:w="4626" w:type="dxa"/>
-            <w:tcBorders>
-              <w:top w:val="single" w:sz="4" w:space="0" w:color="C9D3E3"/>
-              <w:start w:val="single" w:sz="4" w:space="0" w:color="C9D3E3"/>
-              <w:bottom w:val="single" w:sz="4" w:space="0" w:color="C9D3E3"/>
-              <w:end w:val="single" w:sz="4" w:space="0" w:color="C9D3E3"/>
-            </w:tcBorders>
-          </w:tcPr>
-          <w:p>
-            <w:pPr>
-              <w:pStyle w:val="Normal"/>
-              <w:spacing w:lineRule="auto" w:line="262" w:before="0" w:after="0"/>
-              <w:rPr/>
-            </w:pPr>
-            <w:r>
-              <w:rPr>
-                <w:rFonts w:eastAsia="Arial" w:cs="Arial"/>
-                <w:b w:val="false"/>
-                <w:bCs w:val="false"/>
-                <w:sz w:val="21"/>
-                <w:szCs w:val="21"/>
-              </w:rPr>
-              <w:t>Observaciones del tutor; las de semestres cerrados quedan en solo lectura.</w:t>
-            </w:r>
-          </w:p>
-        </w:tc>
-        <w:tc>
-          <w:tcPr>
-            <w:tcW w:w="4212" w:type="dxa"/>
-            <w:tcBorders>
-              <w:top w:val="single" w:sz="4" w:space="0" w:color="C9D3E3"/>
-              <w:start w:val="single" w:sz="4" w:space="0" w:color="C9D3E3"/>
-              <w:bottom w:val="single" w:sz="4" w:space="0" w:color="C9D3E3"/>
-              <w:end w:val="single" w:sz="4" w:space="0" w:color="C9D3E3"/>
-            </w:tcBorders>
-          </w:tcPr>
-          <w:p>
-            <w:pPr>
-              <w:pStyle w:val="Normal"/>
-              <w:spacing w:lineRule="auto" w:line="262" w:before="0" w:after="0"/>
-              <w:rPr/>
-            </w:pPr>
-            <w:r>
-              <w:rPr>
-                <w:rFonts w:eastAsia="Arial" w:cs="Arial"/>
-                <w:b w:val="false"/>
-                <w:bCs w:val="false"/>
-                <w:sz w:val="21"/>
-                <w:szCs w:val="21"/>
-              </w:rPr>
-              <w:t>Entrevista a Coordinación (“candados” para conservar el historial sin modificaciones).</w:t>
-            </w:r>
-          </w:p>
-        </w:tc>
-      </w:tr>
-      <w:tr>
-        <w:trPr>
-          <w:cantSplit/>
-        </w:trPr>
-        <w:tc>
-          <w:tcPr>
-            <w:tcW w:w="4626" w:type="dxa"/>
-            <w:tcBorders>
-              <w:top w:val="single" w:sz="4" w:space="0" w:color="C9D3E3"/>
-              <w:start w:val="single" w:sz="4" w:space="0" w:color="C9D3E3"/>
-              <w:bottom w:val="single" w:sz="4" w:space="0" w:color="C9D3E3"/>
-              <w:end w:val="single" w:sz="4" w:space="0" w:color="C9D3E3"/>
-            </w:tcBorders>
-          </w:tcPr>
-          <w:p>
-            <w:pPr>
-              <w:pStyle w:val="Normal"/>
-              <w:spacing w:lineRule="auto" w:line="262" w:before="0" w:after="0"/>
-              <w:rPr/>
-            </w:pPr>
-            <w:r>
-              <w:rPr>
-                <w:rFonts w:eastAsia="Arial" w:cs="Arial"/>
-                <w:b w:val="false"/>
-                <w:bCs w:val="false"/>
-                <w:sz w:val="21"/>
-                <w:szCs w:val="21"/>
-              </w:rPr>
-              <w:t>Lista de estudiantes que requieren atención, con la razón en etiquetas.</w:t>
-            </w:r>
-          </w:p>
-        </w:tc>
-        <w:tc>
-          <w:tcPr>
-            <w:tcW w:w="4212" w:type="dxa"/>
-            <w:tcBorders>
-              <w:top w:val="single" w:sz="4" w:space="0" w:color="C9D3E3"/>
-              <w:start w:val="single" w:sz="4" w:space="0" w:color="C9D3E3"/>
-              <w:bottom w:val="single" w:sz="4" w:space="0" w:color="C9D3E3"/>
-              <w:end w:val="single" w:sz="4" w:space="0" w:color="C9D3E3"/>
-            </w:tcBorders>
-          </w:tcPr>
-          <w:p>
-            <w:pPr>
-              <w:pStyle w:val="Normal"/>
-              <w:spacing w:lineRule="auto" w:line="262" w:before="0" w:after="0"/>
-              <w:rPr/>
-            </w:pPr>
-            <w:r>
-              <w:rPr>
-                <w:rFonts w:eastAsia="Arial" w:cs="Arial"/>
-                <w:b w:val="false"/>
-                <w:bCs w:val="false"/>
-                <w:sz w:val="21"/>
-                <w:szCs w:val="21"/>
-              </w:rPr>
-              <w:t>Entrevista a Coordinación (proceso de canalización); análisis del estado actual (detección de riesgos desarticulada).</w:t>
-            </w:r>
-          </w:p>
-        </w:tc>
-      </w:tr>
-      <w:tr>
-        <w:trPr>
-          <w:cantSplit/>
-        </w:trPr>
-        <w:tc>
-          <w:tcPr>
-            <w:tcW w:w="4626" w:type="dxa"/>
-            <w:tcBorders>
-              <w:top w:val="single" w:sz="4" w:space="0" w:color="C9D3E3"/>
-              <w:start w:val="single" w:sz="4" w:space="0" w:color="C9D3E3"/>
-              <w:bottom w:val="single" w:sz="4" w:space="0" w:color="C9D3E3"/>
-              <w:end w:val="single" w:sz="4" w:space="0" w:color="C9D3E3"/>
-            </w:tcBorders>
-          </w:tcPr>
-          <w:p>
-            <w:pPr>
-              <w:pStyle w:val="Normal"/>
-              <w:spacing w:lineRule="auto" w:line="262" w:before="0" w:after="0"/>
-              <w:rPr/>
-            </w:pPr>
-            <w:r>
-              <w:rPr>
-                <w:rFonts w:eastAsia="Arial" w:cs="Arial"/>
-                <w:b w:val="false"/>
-                <w:bCs w:val="false"/>
-                <w:sz w:val="21"/>
-                <w:szCs w:val="21"/>
-              </w:rPr>
-              <w:t>Sección Herramientas con formatos para consultar y descargar; la Coordinación los carga desde el back end.</w:t>
-            </w:r>
-          </w:p>
-        </w:tc>
-        <w:tc>
-          <w:tcPr>
-            <w:tcW w:w="4212" w:type="dxa"/>
-            <w:tcBorders>
-              <w:top w:val="single" w:sz="4" w:space="0" w:color="C9D3E3"/>
-              <w:start w:val="single" w:sz="4" w:space="0" w:color="C9D3E3"/>
-              <w:bottom w:val="single" w:sz="4" w:space="0" w:color="C9D3E3"/>
-              <w:end w:val="single" w:sz="4" w:space="0" w:color="C9D3E3"/>
-            </w:tcBorders>
-          </w:tcPr>
-          <w:p>
-            <w:pPr>
-              <w:pStyle w:val="Normal"/>
-              <w:spacing w:lineRule="auto" w:line="262" w:before="0" w:after="0"/>
-              <w:rPr/>
-            </w:pPr>
-            <w:r>
-              <w:rPr>
-                <w:rFonts w:eastAsia="Arial" w:cs="Arial"/>
-                <w:b w:val="false"/>
-                <w:bCs w:val="false"/>
-                <w:sz w:val="21"/>
-                <w:szCs w:val="21"/>
-              </w:rPr>
-              <w:t>Entrevista a Coordinación (“Herramientas para el tutor”); análisis del estado actual (formatos en Word o impresos).</w:t>
-            </w:r>
-          </w:p>
-        </w:tc>
-      </w:tr>
-      <w:tr>
-        <w:trPr>
-          <w:cantSplit/>
-        </w:trPr>
-        <w:tc>
-          <w:tcPr>
-            <w:tcW w:w="4626" w:type="dxa"/>
-            <w:tcBorders>
-              <w:top w:val="single" w:sz="4" w:space="0" w:color="C9D3E3"/>
-              <w:start w:val="single" w:sz="4" w:space="0" w:color="C9D3E3"/>
-              <w:bottom w:val="single" w:sz="4" w:space="0" w:color="C9D3E3"/>
-              <w:end w:val="single" w:sz="4" w:space="0" w:color="C9D3E3"/>
-            </w:tcBorders>
-          </w:tcPr>
-          <w:p>
-            <w:pPr>
-              <w:pStyle w:val="Normal"/>
-              <w:spacing w:lineRule="auto" w:line="262" w:before="0" w:after="0"/>
-              <w:rPr/>
-            </w:pPr>
-            <w:r>
-              <w:rPr>
-                <w:rFonts w:eastAsia="Arial" w:cs="Arial"/>
-                <w:b w:val="false"/>
-                <w:bCs w:val="false"/>
-                <w:sz w:val="21"/>
-                <w:szCs w:val="21"/>
-              </w:rPr>
-              <w:t>Sin pantallas para estudiantes; la comunicación se mantiene en Microsoft Teams.</w:t>
-            </w:r>
-          </w:p>
-        </w:tc>
-        <w:tc>
-          <w:tcPr>
-            <w:tcW w:w="4212" w:type="dxa"/>
-            <w:tcBorders>
-              <w:top w:val="single" w:sz="4" w:space="0" w:color="C9D3E3"/>
-              <w:start w:val="single" w:sz="4" w:space="0" w:color="C9D3E3"/>
-              <w:bottom w:val="single" w:sz="4" w:space="0" w:color="C9D3E3"/>
-              <w:end w:val="single" w:sz="4" w:space="0" w:color="C9D3E3"/>
-            </w:tcBorders>
-          </w:tcPr>
-          <w:p>
-            <w:pPr>
-              <w:pStyle w:val="Normal"/>
-              <w:spacing w:lineRule="auto" w:line="262" w:before="0" w:after="0"/>
-              <w:rPr/>
-            </w:pPr>
-            <w:r>
-              <w:rPr>
-                <w:rFonts w:eastAsia="Arial" w:cs="Arial"/>
-                <w:b w:val="false"/>
-                <w:bCs w:val="false"/>
-                <w:sz w:val="21"/>
-                <w:szCs w:val="21"/>
-              </w:rPr>
-              <w:t>Conclusión de la entrevista a Coordinación; delimitación del proyecto.</w:t>
-            </w:r>
-          </w:p>
-        </w:tc>
-      </w:tr>
-      <w:tr>
-        <w:trPr>
-          <w:cantSplit/>
-        </w:trPr>
-        <w:tc>
-          <w:tcPr>
-            <w:tcW w:w="4626" w:type="dxa"/>
-            <w:tcBorders>
-              <w:top w:val="single" w:sz="4" w:space="0" w:color="C9D3E3"/>
-              <w:start w:val="single" w:sz="4" w:space="0" w:color="C9D3E3"/>
-              <w:bottom w:val="single" w:sz="4" w:space="0" w:color="C9D3E3"/>
-              <w:end w:val="single" w:sz="4" w:space="0" w:color="C9D3E3"/>
-            </w:tcBorders>
-          </w:tcPr>
-          <w:p>
-            <w:pPr>
-              <w:pStyle w:val="Normal"/>
-              <w:spacing w:lineRule="auto" w:line="262" w:before="0" w:after="0"/>
-              <w:rPr/>
-            </w:pPr>
-            <w:r>
-              <w:rPr>
-                <w:rFonts w:eastAsia="Arial" w:cs="Arial"/>
-                <w:b w:val="false"/>
-                <w:bCs w:val="false"/>
-                <w:sz w:val="21"/>
-                <w:szCs w:val="21"/>
-              </w:rPr>
-              <w:t>Inicio muestra los grupos actuales y los estudiantes que requieren atención; el historial de semestres va en una sección separada.</w:t>
-            </w:r>
-          </w:p>
-        </w:tc>
-        <w:tc>
-          <w:tcPr>
-            <w:tcW w:w="4212" w:type="dxa"/>
-            <w:tcBorders>
-              <w:top w:val="single" w:sz="4" w:space="0" w:color="C9D3E3"/>
-              <w:start w:val="single" w:sz="4" w:space="0" w:color="C9D3E3"/>
-              <w:bottom w:val="single" w:sz="4" w:space="0" w:color="C9D3E3"/>
-              <w:end w:val="single" w:sz="4" w:space="0" w:color="C9D3E3"/>
-            </w:tcBorders>
-          </w:tcPr>
-          <w:p>
-            <w:pPr>
-              <w:pStyle w:val="Normal"/>
-              <w:spacing w:lineRule="auto" w:line="262" w:before="0" w:after="0"/>
-              <w:rPr/>
-            </w:pPr>
-            <w:r>
-              <w:rPr>
-                <w:rFonts w:eastAsia="Arial" w:cs="Arial"/>
-                <w:b w:val="false"/>
-                <w:bCs w:val="false"/>
-                <w:sz w:val="21"/>
-                <w:szCs w:val="21"/>
-              </w:rPr>
-              <w:t>Decisión de diseño del residente.</w:t>
-            </w:r>
-          </w:p>
-        </w:tc>
-      </w:tr>
-      <w:tr>
-        <w:trPr>
-          <w:cantSplit/>
-        </w:trPr>
-        <w:tc>
-          <w:tcPr>
-            <w:tcW w:w="4626" w:type="dxa"/>
-            <w:tcBorders>
-              <w:top w:val="single" w:sz="4" w:space="0" w:color="C9D3E3"/>
-              <w:start w:val="single" w:sz="4" w:space="0" w:color="C9D3E3"/>
-              <w:bottom w:val="single" w:sz="4" w:space="0" w:color="C9D3E3"/>
-              <w:end w:val="single" w:sz="4" w:space="0" w:color="C9D3E3"/>
-            </w:tcBorders>
-          </w:tcPr>
-          <w:p>
-            <w:pPr>
-              <w:pStyle w:val="Normal"/>
-              <w:spacing w:lineRule="auto" w:line="262" w:before="0" w:after="0"/>
-              <w:rPr/>
-            </w:pPr>
-            <w:r>
-              <w:rPr>
-                <w:rFonts w:eastAsia="Arial" w:cs="Arial"/>
-                <w:b w:val="false"/>
-                <w:bCs w:val="false"/>
-                <w:sz w:val="21"/>
-                <w:szCs w:val="21"/>
-              </w:rPr>
-              <w:t>Aspecto similar al SII+ TecNM.</w:t>
-            </w:r>
-          </w:p>
-        </w:tc>
-        <w:tc>
-          <w:tcPr>
-            <w:tcW w:w="4212" w:type="dxa"/>
-            <w:tcBorders>
-              <w:top w:val="single" w:sz="4" w:space="0" w:color="C9D3E3"/>
-              <w:start w:val="single" w:sz="4" w:space="0" w:color="C9D3E3"/>
-              <w:bottom w:val="single" w:sz="4" w:space="0" w:color="C9D3E3"/>
-              <w:end w:val="single" w:sz="4" w:space="0" w:color="C9D3E3"/>
-            </w:tcBorders>
-          </w:tcPr>
-          <w:p>
-            <w:pPr>
-              <w:pStyle w:val="Normal"/>
-              <w:spacing w:lineRule="auto" w:line="262" w:before="0" w:after="0"/>
-              <w:rPr/>
-            </w:pPr>
-            <w:r>
-              <w:rPr>
-                <w:rFonts w:eastAsia="Arial" w:cs="Arial"/>
-                <w:b w:val="false"/>
-                <w:bCs w:val="false"/>
-                <w:sz w:val="21"/>
-                <w:szCs w:val="21"/>
-              </w:rPr>
-              <w:t>Objetivo del proyecto (informe preliminar).</w:t>
-            </w:r>
-          </w:p>
-        </w:tc>
-      </w:tr>
-    </w:tbl>
-    <w:p>
-      <w:pPr>
-        <w:pStyle w:val="Normal"/>
-        <w:spacing w:before="0" w:after="60"/>
-        <w:rPr/>
-      </w:pPr>
-      <w:r>
-        <w:rPr/>
+        <w:t>El menú superior tiene cinco secciones: Inicio, Mis Grupos, Estudiantes, Herramientas y Semestres Anteriores. El detalle de un grupo y el expediente de un estudiante se abren desde esas secciones.</w:t>
       </w:r>
     </w:p>
     <w:p>
@@ -3099,127 +1413,13 @@
         <w:rPr>
           <w:rFonts w:eastAsia="Arial" w:cs="Arial"/>
         </w:rPr>
-        <w:t>Elementos considerados y descartados</w:t>
-      </w:r>
-    </w:p>
-    <w:p>
-      <w:pPr>
-        <w:pStyle w:val="ListParagraph"/>
-        <w:numPr>
-          <w:ilvl w:val="0"/>
-          <w:numId w:val="3"/>
-        </w:numPr>
-        <w:spacing w:lineRule="auto" w:line="360" w:before="0" w:after="120"/>
-        <w:jc w:val="both"/>
-        <w:rPr/>
-      </w:pPr>
-      <w:r>
-        <w:rPr>
-          <w:rFonts w:eastAsia="Arial" w:cs="Arial"/>
-          <w:b/>
-          <w:bCs/>
-        </w:rPr>
-        <w:t xml:space="preserve">Ruta del semestre (fases del PIT) en Inicio: </w:t>
-      </w:r>
-      <w:r>
-        <w:rPr>
-          <w:rFonts w:eastAsia="Arial" w:cs="Arial"/>
-        </w:rPr>
-        <w:t>se descartó porque varía demasiado de un tutor a otro.</w:t>
-      </w:r>
-    </w:p>
-    <w:p>
-      <w:pPr>
-        <w:pStyle w:val="ListParagraph"/>
-        <w:numPr>
-          <w:ilvl w:val="0"/>
-          <w:numId w:val="3"/>
-        </w:numPr>
-        <w:spacing w:lineRule="auto" w:line="360" w:before="0" w:after="120"/>
-        <w:jc w:val="both"/>
-        <w:rPr/>
-      </w:pPr>
-      <w:r>
-        <w:rPr>
-          <w:rFonts w:eastAsia="Arial" w:cs="Arial"/>
-          <w:b/>
-          <w:bCs/>
-        </w:rPr>
-        <w:t xml:space="preserve">Tarjetas de resumen y perfil del grupo en Inicio: </w:t>
-      </w:r>
-      <w:r>
-        <w:rPr>
-          <w:rFonts w:eastAsia="Arial" w:cs="Arial"/>
-        </w:rPr>
-        <w:t>se descartaron para dejar Inicio limitado a lo esencial. Ese detalle vive en Mis Grupos y en el detalle de cada grupo.</w:t>
-      </w:r>
-    </w:p>
-    <w:p>
-      <w:pPr>
-        <w:pStyle w:val="ListParagraph"/>
-        <w:numPr>
-          <w:ilvl w:val="0"/>
-          <w:numId w:val="3"/>
-        </w:numPr>
-        <w:spacing w:lineRule="auto" w:line="360" w:before="0" w:after="120"/>
-        <w:jc w:val="both"/>
-        <w:rPr/>
-      </w:pPr>
-      <w:r>
-        <w:rPr>
-          <w:rFonts w:eastAsia="Arial" w:cs="Arial"/>
-          <w:b/>
-          <w:bCs/>
-        </w:rPr>
-        <w:t xml:space="preserve">Herramientas como accesos en Inicio: </w:t>
-      </w:r>
-      <w:r>
-        <w:rPr>
-          <w:rFonts w:eastAsia="Arial" w:cs="Arial"/>
-        </w:rPr>
-        <w:t>se movieron a su propia sección del menú.</w:t>
-      </w:r>
-    </w:p>
-    <w:p>
-      <w:pPr>
-        <w:pStyle w:val="Heading1"/>
-        <w:spacing w:before="360" w:after="160"/>
-        <w:rPr/>
-      </w:pPr>
-      <w:r>
-        <w:rPr>
-          <w:rFonts w:eastAsia="Arial" w:cs="Arial"/>
-        </w:rPr>
-        <w:t>6. Descripción de las pantallas</w:t>
-      </w:r>
-    </w:p>
-    <w:p>
-      <w:pPr>
-        <w:pStyle w:val="Normal"/>
-        <w:keepNext w:val="true"/>
-        <w:spacing w:lineRule="auto" w:line="360" w:before="0" w:after="160"/>
-        <w:jc w:val="both"/>
-        <w:rPr/>
-      </w:pPr>
-      <w:r>
-        <w:rPr>
-          <w:rFonts w:eastAsia="Arial" w:cs="Arial"/>
-        </w:rPr>
-        <w:t>El menú superior tiene cinco secciones: Inicio, Mis Grupos, Estudiantes, Herramientas y Semestres Anteriores. El detalle de un grupo y el expediente de un estudiante se abren desde esas secciones.</w:t>
-      </w:r>
-    </w:p>
-    <w:p>
-      <w:pPr>
-        <w:pStyle w:val="Heading2"/>
-        <w:keepNext w:val="true"/>
-        <w:spacing w:before="240" w:after="120"/>
-        <w:rPr/>
-      </w:pPr>
-      <w:r>
-        <w:rPr>
-          <w:rFonts w:eastAsia="Arial" w:cs="Arial"/>
-        </w:rPr>
-        <w:t>6.1 Inicio de sesión (index.html)</w:t>
+        <w:t>4</w:t>
+      </w:r>
+      <w:r>
+        <w:rPr>
+          <w:rFonts w:eastAsia="Arial" w:cs="Arial"/>
+        </w:rPr>
+        <w:t>.1 Inicio de sesión (index.html)</w:t>
       </w:r>
     </w:p>
     <w:p>
@@ -3316,7 +1516,13 @@
         <w:rPr>
           <w:rFonts w:eastAsia="Arial" w:cs="Arial"/>
         </w:rPr>
-        <w:t>6.2 Inicio (panel-tutor.html)</w:t>
+        <w:t>4</w:t>
+      </w:r>
+      <w:r>
+        <w:rPr>
+          <w:rFonts w:eastAsia="Arial" w:cs="Arial"/>
+        </w:rPr>
+        <w:t>.2 Inicio (panel-tutor.html)</w:t>
       </w:r>
     </w:p>
     <w:p>
@@ -3413,7 +1619,13 @@
         <w:rPr>
           <w:rFonts w:eastAsia="Arial" w:cs="Arial"/>
         </w:rPr>
-        <w:t>6.3 Mis Grupos (mis-grupos.html)</w:t>
+        <w:t>4</w:t>
+      </w:r>
+      <w:r>
+        <w:rPr>
+          <w:rFonts w:eastAsia="Arial" w:cs="Arial"/>
+        </w:rPr>
+        <w:t>.3 Mis Grupos (mis-grupos.html)</w:t>
       </w:r>
     </w:p>
     <w:p>
@@ -3510,7 +1722,13 @@
         <w:rPr>
           <w:rFonts w:eastAsia="Arial" w:cs="Arial"/>
         </w:rPr>
-        <w:t>6.4 Detalle del grupo (ver-grupo.html)</w:t>
+        <w:t>4</w:t>
+      </w:r>
+      <w:r>
+        <w:rPr>
+          <w:rFonts w:eastAsia="Arial" w:cs="Arial"/>
+        </w:rPr>
+        <w:t>.4 Detalle del grupo (ver-grupo.html)</w:t>
       </w:r>
     </w:p>
     <w:p>
@@ -3607,7 +1825,13 @@
         <w:rPr>
           <w:rFonts w:eastAsia="Arial" w:cs="Arial"/>
         </w:rPr>
-        <w:t>6.5 Estudiantes (estudiantes.html)</w:t>
+        <w:t>4</w:t>
+      </w:r>
+      <w:r>
+        <w:rPr>
+          <w:rFonts w:eastAsia="Arial" w:cs="Arial"/>
+        </w:rPr>
+        <w:t>.5 Estudiantes (estudiantes.html)</w:t>
       </w:r>
     </w:p>
     <w:p>
@@ -3704,7 +1928,13 @@
         <w:rPr>
           <w:rFonts w:eastAsia="Arial" w:cs="Arial"/>
         </w:rPr>
-        <w:t>6.6 Expediente del estudiante (expediente.html)</w:t>
+        <w:t>4</w:t>
+      </w:r>
+      <w:r>
+        <w:rPr>
+          <w:rFonts w:eastAsia="Arial" w:cs="Arial"/>
+        </w:rPr>
+        <w:t>.6 Expediente del estudiante (expediente.html)</w:t>
       </w:r>
     </w:p>
     <w:p>
@@ -4014,7 +2244,13 @@
         <w:rPr>
           <w:rFonts w:eastAsia="Arial" w:cs="Arial"/>
         </w:rPr>
-        <w:t>6.7 Herramientas (herramientas.html)</w:t>
+        <w:t>4</w:t>
+      </w:r>
+      <w:r>
+        <w:rPr>
+          <w:rFonts w:eastAsia="Arial" w:cs="Arial"/>
+        </w:rPr>
+        <w:t>.7 Herramientas (herramientas.html)</w:t>
       </w:r>
     </w:p>
     <w:p>
@@ -4111,7 +2347,13 @@
         <w:rPr>
           <w:rFonts w:eastAsia="Arial" w:cs="Arial"/>
         </w:rPr>
-        <w:t>6.8 Semestres Anteriores (semestres-anteriores.html)</w:t>
+        <w:t>4</w:t>
+      </w:r>
+      <w:r>
+        <w:rPr>
+          <w:rFonts w:eastAsia="Arial" w:cs="Arial"/>
+        </w:rPr>
+        <w:t>.8 Semestres Anteriores (semestres-anteriores.html)</w:t>
       </w:r>
     </w:p>
     <w:p>
@@ -4184,9 +2426,6 @@
         <w:pStyle w:val="Normal"/>
         <w:spacing w:before="0" w:after="220"/>
         <w:jc w:val="center"/>
-        <w:rPr/>
-      </w:pPr>
-      <w:r>
         <w:rPr>
           <w:rFonts w:eastAsia="Arial" w:cs="Arial"/>
           <w:i/>
@@ -4194,7 +2433,62 @@
           <w:sz w:val="20"/>
           <w:szCs w:val="20"/>
         </w:rPr>
+      </w:pPr>
+      <w:r>
+        <w:rPr>
+          <w:rFonts w:eastAsia="Arial" w:cs="Arial"/>
+          <w:i/>
+          <w:iCs/>
+          <w:sz w:val="20"/>
+          <w:szCs w:val="20"/>
+        </w:rPr>
         <w:t>Figura 9. Semestres Anteriores.</w:t>
+      </w:r>
+    </w:p>
+    <w:p>
+      <w:pPr>
+        <w:pStyle w:val="Normal"/>
+        <w:spacing w:before="0" w:after="220"/>
+        <w:jc w:val="center"/>
+        <w:rPr>
+          <w:rFonts w:eastAsia="Arial" w:cs="Arial"/>
+          <w:i/>
+          <w:iCs/>
+          <w:sz w:val="20"/>
+          <w:szCs w:val="20"/>
+        </w:rPr>
+      </w:pPr>
+      <w:r>
+        <w:rPr>
+          <w:rFonts w:eastAsia="Arial" w:cs="Arial"/>
+          <w:i/>
+          <w:iCs/>
+          <w:sz w:val="20"/>
+          <w:szCs w:val="20"/>
+        </w:rPr>
+      </w:r>
+    </w:p>
+    <w:p>
+      <w:pPr>
+        <w:pStyle w:val="Normal"/>
+        <w:spacing w:before="0" w:after="220"/>
+        <w:jc w:val="center"/>
+        <w:rPr>
+          <w:rFonts w:eastAsia="Arial" w:cs="Arial"/>
+          <w:i/>
+          <w:iCs/>
+          <w:sz w:val="20"/>
+          <w:szCs w:val="20"/>
+        </w:rPr>
+      </w:pPr>
+      <w:r>
+        <w:rPr>
+          <w:rFonts w:eastAsia="Arial" w:cs="Arial"/>
+          <w:i/>
+          <w:iCs/>
+          <w:sz w:val="20"/>
+          <w:szCs w:val="20"/>
+        </w:rPr>
       </w:r>
     </w:p>
     <w:p>
@@ -4207,7 +2501,28 @@
         <w:rPr>
           <w:rFonts w:eastAsia="Arial" w:cs="Arial"/>
         </w:rPr>
-        <w:t>7. Mapa de navegación</w:t>
+        <w:t>5</w:t>
+      </w:r>
+      <w:r>
+        <w:rPr>
+          <w:rFonts w:eastAsia="Arial" w:cs="Arial"/>
+        </w:rPr>
+        <w:t>. Estructura técnica</w:t>
+      </w:r>
+    </w:p>
+    <w:p>
+      <w:pPr>
+        <w:pStyle w:val="Normal"/>
+        <w:keepNext w:val="false"/>
+        <w:spacing w:lineRule="auto" w:line="360" w:before="0" w:after="160"/>
+        <w:jc w:val="both"/>
+        <w:rPr/>
+      </w:pPr>
+      <w:r>
+        <w:rPr>
+          <w:rFonts w:eastAsia="Arial" w:cs="Arial"/>
+        </w:rPr>
+        <w:t>El prototipo usa HTML5, CSS y JavaScript sin frameworks ni servidor. Los estilos y scripts compartidos están separados por archivo para reutilizarlos en las demás pantallas.</w:t>
       </w:r>
     </w:p>
     <w:tbl>
@@ -4224,9 +2539,8 @@
         </w:tblCellMar>
       </w:tblPr>
       <w:tblGrid>
-        <w:gridCol w:w="2548"/>
-        <w:gridCol w:w="2552"/>
-        <w:gridCol w:w="3738"/>
+        <w:gridCol w:w="4152"/>
+        <w:gridCol w:w="4686"/>
       </w:tblGrid>
       <w:tr>
         <w:trPr>
@@ -4235,971 +2549,7 @@
         </w:trPr>
         <w:tc>
           <w:tcPr>
-            <w:tcW w:w="2548" w:type="dxa"/>
-            <w:tcBorders>
-              <w:top w:val="single" w:sz="4" w:space="0" w:color="C9D3E3"/>
-              <w:start w:val="single" w:sz="4" w:space="0" w:color="C9D3E3"/>
-              <w:bottom w:val="single" w:sz="4" w:space="0" w:color="C9D3E3"/>
-              <w:end w:val="single" w:sz="4" w:space="0" w:color="C9D3E3"/>
-            </w:tcBorders>
-            <w:shd w:color="auto" w:fill="E3EDF8" w:val="clear"/>
-          </w:tcPr>
-          <w:p>
-            <w:pPr>
-              <w:pStyle w:val="Normal"/>
-              <w:spacing w:lineRule="auto" w:line="262" w:before="0" w:after="0"/>
-              <w:rPr/>
-            </w:pPr>
-            <w:r>
-              <w:rPr>
-                <w:rFonts w:eastAsia="Arial" w:cs="Arial"/>
-                <w:b/>
-                <w:bCs/>
-                <w:sz w:val="21"/>
-                <w:szCs w:val="21"/>
-              </w:rPr>
-              <w:t>Desde</w:t>
-            </w:r>
-          </w:p>
-        </w:tc>
-        <w:tc>
-          <w:tcPr>
-            <w:tcW w:w="2552" w:type="dxa"/>
-            <w:tcBorders>
-              <w:top w:val="single" w:sz="4" w:space="0" w:color="C9D3E3"/>
-              <w:start w:val="single" w:sz="4" w:space="0" w:color="C9D3E3"/>
-              <w:bottom w:val="single" w:sz="4" w:space="0" w:color="C9D3E3"/>
-              <w:end w:val="single" w:sz="4" w:space="0" w:color="C9D3E3"/>
-            </w:tcBorders>
-            <w:shd w:color="auto" w:fill="E3EDF8" w:val="clear"/>
-          </w:tcPr>
-          <w:p>
-            <w:pPr>
-              <w:pStyle w:val="Normal"/>
-              <w:spacing w:lineRule="auto" w:line="262" w:before="0" w:after="0"/>
-              <w:rPr/>
-            </w:pPr>
-            <w:r>
-              <w:rPr>
-                <w:rFonts w:eastAsia="Arial" w:cs="Arial"/>
-                <w:b/>
-                <w:bCs/>
-                <w:sz w:val="21"/>
-                <w:szCs w:val="21"/>
-              </w:rPr>
-              <w:t>Acción</w:t>
-            </w:r>
-          </w:p>
-        </w:tc>
-        <w:tc>
-          <w:tcPr>
-            <w:tcW w:w="3738" w:type="dxa"/>
-            <w:tcBorders>
-              <w:top w:val="single" w:sz="4" w:space="0" w:color="C9D3E3"/>
-              <w:start w:val="single" w:sz="4" w:space="0" w:color="C9D3E3"/>
-              <w:bottom w:val="single" w:sz="4" w:space="0" w:color="C9D3E3"/>
-              <w:end w:val="single" w:sz="4" w:space="0" w:color="C9D3E3"/>
-            </w:tcBorders>
-            <w:shd w:color="auto" w:fill="E3EDF8" w:val="clear"/>
-          </w:tcPr>
-          <w:p>
-            <w:pPr>
-              <w:pStyle w:val="Normal"/>
-              <w:spacing w:lineRule="auto" w:line="262" w:before="0" w:after="0"/>
-              <w:rPr/>
-            </w:pPr>
-            <w:r>
-              <w:rPr>
-                <w:rFonts w:eastAsia="Arial" w:cs="Arial"/>
-                <w:b/>
-                <w:bCs/>
-                <w:sz w:val="21"/>
-                <w:szCs w:val="21"/>
-              </w:rPr>
-              <w:t>Destino</w:t>
-            </w:r>
-          </w:p>
-        </w:tc>
-      </w:tr>
-      <w:tr>
-        <w:trPr>
-          <w:cantSplit/>
-        </w:trPr>
-        <w:tc>
-          <w:tcPr>
-            <w:tcW w:w="2548" w:type="dxa"/>
-            <w:tcBorders>
-              <w:top w:val="single" w:sz="4" w:space="0" w:color="C9D3E3"/>
-              <w:start w:val="single" w:sz="4" w:space="0" w:color="C9D3E3"/>
-              <w:bottom w:val="single" w:sz="4" w:space="0" w:color="C9D3E3"/>
-              <w:end w:val="single" w:sz="4" w:space="0" w:color="C9D3E3"/>
-            </w:tcBorders>
-          </w:tcPr>
-          <w:p>
-            <w:pPr>
-              <w:pStyle w:val="Normal"/>
-              <w:spacing w:lineRule="auto" w:line="262" w:before="0" w:after="0"/>
-              <w:rPr/>
-            </w:pPr>
-            <w:r>
-              <w:rPr>
-                <w:rFonts w:eastAsia="Arial" w:cs="Arial"/>
-                <w:b w:val="false"/>
-                <w:bCs w:val="false"/>
-                <w:sz w:val="21"/>
-                <w:szCs w:val="21"/>
-              </w:rPr>
-              <w:t>Inicio de sesión</w:t>
-            </w:r>
-          </w:p>
-        </w:tc>
-        <w:tc>
-          <w:tcPr>
-            <w:tcW w:w="2552" w:type="dxa"/>
-            <w:tcBorders>
-              <w:top w:val="single" w:sz="4" w:space="0" w:color="C9D3E3"/>
-              <w:start w:val="single" w:sz="4" w:space="0" w:color="C9D3E3"/>
-              <w:bottom w:val="single" w:sz="4" w:space="0" w:color="C9D3E3"/>
-              <w:end w:val="single" w:sz="4" w:space="0" w:color="C9D3E3"/>
-            </w:tcBorders>
-          </w:tcPr>
-          <w:p>
-            <w:pPr>
-              <w:pStyle w:val="Normal"/>
-              <w:spacing w:lineRule="auto" w:line="262" w:before="0" w:after="0"/>
-              <w:rPr/>
-            </w:pPr>
-            <w:r>
-              <w:rPr>
-                <w:rFonts w:eastAsia="Arial" w:cs="Arial"/>
-                <w:b w:val="false"/>
-                <w:bCs w:val="false"/>
-                <w:sz w:val="21"/>
-                <w:szCs w:val="21"/>
-              </w:rPr>
-              <w:t>Iniciar sesión</w:t>
-            </w:r>
-          </w:p>
-        </w:tc>
-        <w:tc>
-          <w:tcPr>
-            <w:tcW w:w="3738" w:type="dxa"/>
-            <w:tcBorders>
-              <w:top w:val="single" w:sz="4" w:space="0" w:color="C9D3E3"/>
-              <w:start w:val="single" w:sz="4" w:space="0" w:color="C9D3E3"/>
-              <w:bottom w:val="single" w:sz="4" w:space="0" w:color="C9D3E3"/>
-              <w:end w:val="single" w:sz="4" w:space="0" w:color="C9D3E3"/>
-            </w:tcBorders>
-          </w:tcPr>
-          <w:p>
-            <w:pPr>
-              <w:pStyle w:val="Normal"/>
-              <w:spacing w:lineRule="auto" w:line="262" w:before="0" w:after="0"/>
-              <w:rPr/>
-            </w:pPr>
-            <w:r>
-              <w:rPr>
-                <w:rFonts w:eastAsia="Arial" w:cs="Arial"/>
-                <w:b w:val="false"/>
-                <w:bCs w:val="false"/>
-                <w:sz w:val="21"/>
-                <w:szCs w:val="21"/>
-              </w:rPr>
-              <w:t>Inicio</w:t>
-            </w:r>
-          </w:p>
-        </w:tc>
-      </w:tr>
-      <w:tr>
-        <w:trPr>
-          <w:cantSplit/>
-        </w:trPr>
-        <w:tc>
-          <w:tcPr>
-            <w:tcW w:w="2548" w:type="dxa"/>
-            <w:tcBorders>
-              <w:top w:val="single" w:sz="4" w:space="0" w:color="C9D3E3"/>
-              <w:start w:val="single" w:sz="4" w:space="0" w:color="C9D3E3"/>
-              <w:bottom w:val="single" w:sz="4" w:space="0" w:color="C9D3E3"/>
-              <w:end w:val="single" w:sz="4" w:space="0" w:color="C9D3E3"/>
-            </w:tcBorders>
-          </w:tcPr>
-          <w:p>
-            <w:pPr>
-              <w:pStyle w:val="Normal"/>
-              <w:spacing w:lineRule="auto" w:line="262" w:before="0" w:after="0"/>
-              <w:rPr/>
-            </w:pPr>
-            <w:r>
-              <w:rPr>
-                <w:rFonts w:eastAsia="Arial" w:cs="Arial"/>
-                <w:b w:val="false"/>
-                <w:bCs w:val="false"/>
-                <w:sz w:val="21"/>
-                <w:szCs w:val="21"/>
-              </w:rPr>
-              <w:t>Cualquier pantalla interna</w:t>
-            </w:r>
-          </w:p>
-        </w:tc>
-        <w:tc>
-          <w:tcPr>
-            <w:tcW w:w="2552" w:type="dxa"/>
-            <w:tcBorders>
-              <w:top w:val="single" w:sz="4" w:space="0" w:color="C9D3E3"/>
-              <w:start w:val="single" w:sz="4" w:space="0" w:color="C9D3E3"/>
-              <w:bottom w:val="single" w:sz="4" w:space="0" w:color="C9D3E3"/>
-              <w:end w:val="single" w:sz="4" w:space="0" w:color="C9D3E3"/>
-            </w:tcBorders>
-          </w:tcPr>
-          <w:p>
-            <w:pPr>
-              <w:pStyle w:val="Normal"/>
-              <w:spacing w:lineRule="auto" w:line="262" w:before="0" w:after="0"/>
-              <w:rPr/>
-            </w:pPr>
-            <w:r>
-              <w:rPr>
-                <w:rFonts w:eastAsia="Arial" w:cs="Arial"/>
-                <w:b w:val="false"/>
-                <w:bCs w:val="false"/>
-                <w:sz w:val="21"/>
-                <w:szCs w:val="21"/>
-              </w:rPr>
-              <w:t>Menú superior</w:t>
-            </w:r>
-          </w:p>
-        </w:tc>
-        <w:tc>
-          <w:tcPr>
-            <w:tcW w:w="3738" w:type="dxa"/>
-            <w:tcBorders>
-              <w:top w:val="single" w:sz="4" w:space="0" w:color="C9D3E3"/>
-              <w:start w:val="single" w:sz="4" w:space="0" w:color="C9D3E3"/>
-              <w:bottom w:val="single" w:sz="4" w:space="0" w:color="C9D3E3"/>
-              <w:end w:val="single" w:sz="4" w:space="0" w:color="C9D3E3"/>
-            </w:tcBorders>
-          </w:tcPr>
-          <w:p>
-            <w:pPr>
-              <w:pStyle w:val="Normal"/>
-              <w:spacing w:lineRule="auto" w:line="262" w:before="0" w:after="0"/>
-              <w:rPr/>
-            </w:pPr>
-            <w:r>
-              <w:rPr>
-                <w:rFonts w:eastAsia="Arial" w:cs="Arial"/>
-                <w:b w:val="false"/>
-                <w:bCs w:val="false"/>
-                <w:sz w:val="21"/>
-                <w:szCs w:val="21"/>
-              </w:rPr>
-              <w:t>Inicio, Mis Grupos, Estudiantes, Herramientas o Semestres Anteriores</w:t>
-            </w:r>
-          </w:p>
-        </w:tc>
-      </w:tr>
-      <w:tr>
-        <w:trPr>
-          <w:cantSplit/>
-        </w:trPr>
-        <w:tc>
-          <w:tcPr>
-            <w:tcW w:w="2548" w:type="dxa"/>
-            <w:tcBorders>
-              <w:top w:val="single" w:sz="4" w:space="0" w:color="C9D3E3"/>
-              <w:start w:val="single" w:sz="4" w:space="0" w:color="C9D3E3"/>
-              <w:bottom w:val="single" w:sz="4" w:space="0" w:color="C9D3E3"/>
-              <w:end w:val="single" w:sz="4" w:space="0" w:color="C9D3E3"/>
-            </w:tcBorders>
-          </w:tcPr>
-          <w:p>
-            <w:pPr>
-              <w:pStyle w:val="Normal"/>
-              <w:spacing w:lineRule="auto" w:line="262" w:before="0" w:after="0"/>
-              <w:rPr/>
-            </w:pPr>
-            <w:r>
-              <w:rPr>
-                <w:rFonts w:eastAsia="Arial" w:cs="Arial"/>
-                <w:b w:val="false"/>
-                <w:bCs w:val="false"/>
-                <w:sz w:val="21"/>
-                <w:szCs w:val="21"/>
-              </w:rPr>
-              <w:t>Cualquier pantalla interna</w:t>
-            </w:r>
-          </w:p>
-        </w:tc>
-        <w:tc>
-          <w:tcPr>
-            <w:tcW w:w="2552" w:type="dxa"/>
-            <w:tcBorders>
-              <w:top w:val="single" w:sz="4" w:space="0" w:color="C9D3E3"/>
-              <w:start w:val="single" w:sz="4" w:space="0" w:color="C9D3E3"/>
-              <w:bottom w:val="single" w:sz="4" w:space="0" w:color="C9D3E3"/>
-              <w:end w:val="single" w:sz="4" w:space="0" w:color="C9D3E3"/>
-            </w:tcBorders>
-          </w:tcPr>
-          <w:p>
-            <w:pPr>
-              <w:pStyle w:val="Normal"/>
-              <w:spacing w:lineRule="auto" w:line="262" w:before="0" w:after="0"/>
-              <w:rPr/>
-            </w:pPr>
-            <w:r>
-              <w:rPr>
-                <w:rFonts w:eastAsia="Arial" w:cs="Arial"/>
-                <w:b w:val="false"/>
-                <w:bCs w:val="false"/>
-                <w:sz w:val="21"/>
-                <w:szCs w:val="21"/>
-              </w:rPr>
-              <w:t>Botón de cerrar sesión</w:t>
-            </w:r>
-          </w:p>
-        </w:tc>
-        <w:tc>
-          <w:tcPr>
-            <w:tcW w:w="3738" w:type="dxa"/>
-            <w:tcBorders>
-              <w:top w:val="single" w:sz="4" w:space="0" w:color="C9D3E3"/>
-              <w:start w:val="single" w:sz="4" w:space="0" w:color="C9D3E3"/>
-              <w:bottom w:val="single" w:sz="4" w:space="0" w:color="C9D3E3"/>
-              <w:end w:val="single" w:sz="4" w:space="0" w:color="C9D3E3"/>
-            </w:tcBorders>
-          </w:tcPr>
-          <w:p>
-            <w:pPr>
-              <w:pStyle w:val="Normal"/>
-              <w:spacing w:lineRule="auto" w:line="262" w:before="0" w:after="0"/>
-              <w:rPr/>
-            </w:pPr>
-            <w:r>
-              <w:rPr>
-                <w:rFonts w:eastAsia="Arial" w:cs="Arial"/>
-                <w:b w:val="false"/>
-                <w:bCs w:val="false"/>
-                <w:sz w:val="21"/>
-                <w:szCs w:val="21"/>
-              </w:rPr>
-              <w:t>Inicio de sesión</w:t>
-            </w:r>
-          </w:p>
-        </w:tc>
-      </w:tr>
-      <w:tr>
-        <w:trPr>
-          <w:cantSplit/>
-        </w:trPr>
-        <w:tc>
-          <w:tcPr>
-            <w:tcW w:w="2548" w:type="dxa"/>
-            <w:tcBorders>
-              <w:top w:val="single" w:sz="4" w:space="0" w:color="C9D3E3"/>
-              <w:start w:val="single" w:sz="4" w:space="0" w:color="C9D3E3"/>
-              <w:bottom w:val="single" w:sz="4" w:space="0" w:color="C9D3E3"/>
-              <w:end w:val="single" w:sz="4" w:space="0" w:color="C9D3E3"/>
-            </w:tcBorders>
-          </w:tcPr>
-          <w:p>
-            <w:pPr>
-              <w:pStyle w:val="Normal"/>
-              <w:spacing w:lineRule="auto" w:line="262" w:before="0" w:after="0"/>
-              <w:rPr/>
-            </w:pPr>
-            <w:r>
-              <w:rPr>
-                <w:rFonts w:eastAsia="Arial" w:cs="Arial"/>
-                <w:b w:val="false"/>
-                <w:bCs w:val="false"/>
-                <w:sz w:val="21"/>
-                <w:szCs w:val="21"/>
-              </w:rPr>
-              <w:t>Inicio</w:t>
-            </w:r>
-          </w:p>
-        </w:tc>
-        <w:tc>
-          <w:tcPr>
-            <w:tcW w:w="2552" w:type="dxa"/>
-            <w:tcBorders>
-              <w:top w:val="single" w:sz="4" w:space="0" w:color="C9D3E3"/>
-              <w:start w:val="single" w:sz="4" w:space="0" w:color="C9D3E3"/>
-              <w:bottom w:val="single" w:sz="4" w:space="0" w:color="C9D3E3"/>
-              <w:end w:val="single" w:sz="4" w:space="0" w:color="C9D3E3"/>
-            </w:tcBorders>
-          </w:tcPr>
-          <w:p>
-            <w:pPr>
-              <w:pStyle w:val="Normal"/>
-              <w:spacing w:lineRule="auto" w:line="262" w:before="0" w:after="0"/>
-              <w:rPr/>
-            </w:pPr>
-            <w:r>
-              <w:rPr>
-                <w:rFonts w:eastAsia="Arial" w:cs="Arial"/>
-                <w:b w:val="false"/>
-                <w:bCs w:val="false"/>
-                <w:sz w:val="21"/>
-                <w:szCs w:val="21"/>
-              </w:rPr>
-              <w:t>Ver expediente</w:t>
-            </w:r>
-          </w:p>
-        </w:tc>
-        <w:tc>
-          <w:tcPr>
-            <w:tcW w:w="3738" w:type="dxa"/>
-            <w:tcBorders>
-              <w:top w:val="single" w:sz="4" w:space="0" w:color="C9D3E3"/>
-              <w:start w:val="single" w:sz="4" w:space="0" w:color="C9D3E3"/>
-              <w:bottom w:val="single" w:sz="4" w:space="0" w:color="C9D3E3"/>
-              <w:end w:val="single" w:sz="4" w:space="0" w:color="C9D3E3"/>
-            </w:tcBorders>
-          </w:tcPr>
-          <w:p>
-            <w:pPr>
-              <w:pStyle w:val="Normal"/>
-              <w:spacing w:lineRule="auto" w:line="262" w:before="0" w:after="0"/>
-              <w:rPr/>
-            </w:pPr>
-            <w:r>
-              <w:rPr>
-                <w:rFonts w:eastAsia="Arial" w:cs="Arial"/>
-                <w:b w:val="false"/>
-                <w:bCs w:val="false"/>
-                <w:sz w:val="21"/>
-                <w:szCs w:val="21"/>
-              </w:rPr>
-              <w:t>Expediente del estudiante</w:t>
-            </w:r>
-          </w:p>
-        </w:tc>
-      </w:tr>
-      <w:tr>
-        <w:trPr>
-          <w:cantSplit/>
-        </w:trPr>
-        <w:tc>
-          <w:tcPr>
-            <w:tcW w:w="2548" w:type="dxa"/>
-            <w:tcBorders>
-              <w:top w:val="single" w:sz="4" w:space="0" w:color="C9D3E3"/>
-              <w:start w:val="single" w:sz="4" w:space="0" w:color="C9D3E3"/>
-              <w:bottom w:val="single" w:sz="4" w:space="0" w:color="C9D3E3"/>
-              <w:end w:val="single" w:sz="4" w:space="0" w:color="C9D3E3"/>
-            </w:tcBorders>
-          </w:tcPr>
-          <w:p>
-            <w:pPr>
-              <w:pStyle w:val="Normal"/>
-              <w:spacing w:lineRule="auto" w:line="262" w:before="0" w:after="0"/>
-              <w:rPr/>
-            </w:pPr>
-            <w:r>
-              <w:rPr>
-                <w:rFonts w:eastAsia="Arial" w:cs="Arial"/>
-                <w:b w:val="false"/>
-                <w:bCs w:val="false"/>
-                <w:sz w:val="21"/>
-                <w:szCs w:val="21"/>
-              </w:rPr>
-              <w:t>Mis Grupos</w:t>
-            </w:r>
-          </w:p>
-        </w:tc>
-        <w:tc>
-          <w:tcPr>
-            <w:tcW w:w="2552" w:type="dxa"/>
-            <w:tcBorders>
-              <w:top w:val="single" w:sz="4" w:space="0" w:color="C9D3E3"/>
-              <w:start w:val="single" w:sz="4" w:space="0" w:color="C9D3E3"/>
-              <w:bottom w:val="single" w:sz="4" w:space="0" w:color="C9D3E3"/>
-              <w:end w:val="single" w:sz="4" w:space="0" w:color="C9D3E3"/>
-            </w:tcBorders>
-          </w:tcPr>
-          <w:p>
-            <w:pPr>
-              <w:pStyle w:val="Normal"/>
-              <w:spacing w:lineRule="auto" w:line="262" w:before="0" w:after="0"/>
-              <w:rPr/>
-            </w:pPr>
-            <w:r>
-              <w:rPr>
-                <w:rFonts w:eastAsia="Arial" w:cs="Arial"/>
-                <w:b w:val="false"/>
-                <w:bCs w:val="false"/>
-                <w:sz w:val="21"/>
-                <w:szCs w:val="21"/>
-              </w:rPr>
-              <w:t>Ver grupo</w:t>
-            </w:r>
-          </w:p>
-        </w:tc>
-        <w:tc>
-          <w:tcPr>
-            <w:tcW w:w="3738" w:type="dxa"/>
-            <w:tcBorders>
-              <w:top w:val="single" w:sz="4" w:space="0" w:color="C9D3E3"/>
-              <w:start w:val="single" w:sz="4" w:space="0" w:color="C9D3E3"/>
-              <w:bottom w:val="single" w:sz="4" w:space="0" w:color="C9D3E3"/>
-              <w:end w:val="single" w:sz="4" w:space="0" w:color="C9D3E3"/>
-            </w:tcBorders>
-          </w:tcPr>
-          <w:p>
-            <w:pPr>
-              <w:pStyle w:val="Normal"/>
-              <w:spacing w:lineRule="auto" w:line="262" w:before="0" w:after="0"/>
-              <w:rPr/>
-            </w:pPr>
-            <w:r>
-              <w:rPr>
-                <w:rFonts w:eastAsia="Arial" w:cs="Arial"/>
-                <w:b w:val="false"/>
-                <w:bCs w:val="false"/>
-                <w:sz w:val="21"/>
-                <w:szCs w:val="21"/>
-              </w:rPr>
-              <w:t>Detalle del grupo</w:t>
-            </w:r>
-          </w:p>
-        </w:tc>
-      </w:tr>
-      <w:tr>
-        <w:trPr>
-          <w:cantSplit/>
-        </w:trPr>
-        <w:tc>
-          <w:tcPr>
-            <w:tcW w:w="2548" w:type="dxa"/>
-            <w:tcBorders>
-              <w:top w:val="single" w:sz="4" w:space="0" w:color="C9D3E3"/>
-              <w:start w:val="single" w:sz="4" w:space="0" w:color="C9D3E3"/>
-              <w:bottom w:val="single" w:sz="4" w:space="0" w:color="C9D3E3"/>
-              <w:end w:val="single" w:sz="4" w:space="0" w:color="C9D3E3"/>
-            </w:tcBorders>
-          </w:tcPr>
-          <w:p>
-            <w:pPr>
-              <w:pStyle w:val="Normal"/>
-              <w:spacing w:lineRule="auto" w:line="262" w:before="0" w:after="0"/>
-              <w:rPr/>
-            </w:pPr>
-            <w:r>
-              <w:rPr>
-                <w:rFonts w:eastAsia="Arial" w:cs="Arial"/>
-                <w:b w:val="false"/>
-                <w:bCs w:val="false"/>
-                <w:sz w:val="21"/>
-                <w:szCs w:val="21"/>
-              </w:rPr>
-              <w:t>Detalle del grupo</w:t>
-            </w:r>
-          </w:p>
-        </w:tc>
-        <w:tc>
-          <w:tcPr>
-            <w:tcW w:w="2552" w:type="dxa"/>
-            <w:tcBorders>
-              <w:top w:val="single" w:sz="4" w:space="0" w:color="C9D3E3"/>
-              <w:start w:val="single" w:sz="4" w:space="0" w:color="C9D3E3"/>
-              <w:bottom w:val="single" w:sz="4" w:space="0" w:color="C9D3E3"/>
-              <w:end w:val="single" w:sz="4" w:space="0" w:color="C9D3E3"/>
-            </w:tcBorders>
-          </w:tcPr>
-          <w:p>
-            <w:pPr>
-              <w:pStyle w:val="Normal"/>
-              <w:spacing w:lineRule="auto" w:line="262" w:before="0" w:after="0"/>
-              <w:rPr/>
-            </w:pPr>
-            <w:r>
-              <w:rPr>
-                <w:rFonts w:eastAsia="Arial" w:cs="Arial"/>
-                <w:b w:val="false"/>
-                <w:bCs w:val="false"/>
-                <w:sz w:val="21"/>
-                <w:szCs w:val="21"/>
-              </w:rPr>
-              <w:t>Ver expediente</w:t>
-            </w:r>
-          </w:p>
-        </w:tc>
-        <w:tc>
-          <w:tcPr>
-            <w:tcW w:w="3738" w:type="dxa"/>
-            <w:tcBorders>
-              <w:top w:val="single" w:sz="4" w:space="0" w:color="C9D3E3"/>
-              <w:start w:val="single" w:sz="4" w:space="0" w:color="C9D3E3"/>
-              <w:bottom w:val="single" w:sz="4" w:space="0" w:color="C9D3E3"/>
-              <w:end w:val="single" w:sz="4" w:space="0" w:color="C9D3E3"/>
-            </w:tcBorders>
-          </w:tcPr>
-          <w:p>
-            <w:pPr>
-              <w:pStyle w:val="Normal"/>
-              <w:spacing w:lineRule="auto" w:line="262" w:before="0" w:after="0"/>
-              <w:rPr/>
-            </w:pPr>
-            <w:r>
-              <w:rPr>
-                <w:rFonts w:eastAsia="Arial" w:cs="Arial"/>
-                <w:b w:val="false"/>
-                <w:bCs w:val="false"/>
-                <w:sz w:val="21"/>
-                <w:szCs w:val="21"/>
-              </w:rPr>
-              <w:t>Expediente del estudiante</w:t>
-            </w:r>
-          </w:p>
-        </w:tc>
-      </w:tr>
-      <w:tr>
-        <w:trPr>
-          <w:cantSplit/>
-        </w:trPr>
-        <w:tc>
-          <w:tcPr>
-            <w:tcW w:w="2548" w:type="dxa"/>
-            <w:tcBorders>
-              <w:top w:val="single" w:sz="4" w:space="0" w:color="C9D3E3"/>
-              <w:start w:val="single" w:sz="4" w:space="0" w:color="C9D3E3"/>
-              <w:bottom w:val="single" w:sz="4" w:space="0" w:color="C9D3E3"/>
-              <w:end w:val="single" w:sz="4" w:space="0" w:color="C9D3E3"/>
-            </w:tcBorders>
-          </w:tcPr>
-          <w:p>
-            <w:pPr>
-              <w:pStyle w:val="Normal"/>
-              <w:spacing w:lineRule="auto" w:line="262" w:before="0" w:after="0"/>
-              <w:rPr/>
-            </w:pPr>
-            <w:r>
-              <w:rPr>
-                <w:rFonts w:eastAsia="Arial" w:cs="Arial"/>
-                <w:b w:val="false"/>
-                <w:bCs w:val="false"/>
-                <w:sz w:val="21"/>
-                <w:szCs w:val="21"/>
-              </w:rPr>
-              <w:t>Estudiantes</w:t>
-            </w:r>
-          </w:p>
-        </w:tc>
-        <w:tc>
-          <w:tcPr>
-            <w:tcW w:w="2552" w:type="dxa"/>
-            <w:tcBorders>
-              <w:top w:val="single" w:sz="4" w:space="0" w:color="C9D3E3"/>
-              <w:start w:val="single" w:sz="4" w:space="0" w:color="C9D3E3"/>
-              <w:bottom w:val="single" w:sz="4" w:space="0" w:color="C9D3E3"/>
-              <w:end w:val="single" w:sz="4" w:space="0" w:color="C9D3E3"/>
-            </w:tcBorders>
-          </w:tcPr>
-          <w:p>
-            <w:pPr>
-              <w:pStyle w:val="Normal"/>
-              <w:spacing w:lineRule="auto" w:line="262" w:before="0" w:after="0"/>
-              <w:rPr/>
-            </w:pPr>
-            <w:r>
-              <w:rPr>
-                <w:rFonts w:eastAsia="Arial" w:cs="Arial"/>
-                <w:b w:val="false"/>
-                <w:bCs w:val="false"/>
-                <w:sz w:val="21"/>
-                <w:szCs w:val="21"/>
-              </w:rPr>
-              <w:t>Ver expediente</w:t>
-            </w:r>
-          </w:p>
-        </w:tc>
-        <w:tc>
-          <w:tcPr>
-            <w:tcW w:w="3738" w:type="dxa"/>
-            <w:tcBorders>
-              <w:top w:val="single" w:sz="4" w:space="0" w:color="C9D3E3"/>
-              <w:start w:val="single" w:sz="4" w:space="0" w:color="C9D3E3"/>
-              <w:bottom w:val="single" w:sz="4" w:space="0" w:color="C9D3E3"/>
-              <w:end w:val="single" w:sz="4" w:space="0" w:color="C9D3E3"/>
-            </w:tcBorders>
-          </w:tcPr>
-          <w:p>
-            <w:pPr>
-              <w:pStyle w:val="Normal"/>
-              <w:spacing w:lineRule="auto" w:line="262" w:before="0" w:after="0"/>
-              <w:rPr/>
-            </w:pPr>
-            <w:r>
-              <w:rPr>
-                <w:rFonts w:eastAsia="Arial" w:cs="Arial"/>
-                <w:b w:val="false"/>
-                <w:bCs w:val="false"/>
-                <w:sz w:val="21"/>
-                <w:szCs w:val="21"/>
-              </w:rPr>
-              <w:t>Expediente del estudiante</w:t>
-            </w:r>
-          </w:p>
-        </w:tc>
-      </w:tr>
-      <w:tr>
-        <w:trPr>
-          <w:cantSplit/>
-        </w:trPr>
-        <w:tc>
-          <w:tcPr>
-            <w:tcW w:w="2548" w:type="dxa"/>
-            <w:tcBorders>
-              <w:top w:val="single" w:sz="4" w:space="0" w:color="C9D3E3"/>
-              <w:start w:val="single" w:sz="4" w:space="0" w:color="C9D3E3"/>
-              <w:bottom w:val="single" w:sz="4" w:space="0" w:color="C9D3E3"/>
-              <w:end w:val="single" w:sz="4" w:space="0" w:color="C9D3E3"/>
-            </w:tcBorders>
-          </w:tcPr>
-          <w:p>
-            <w:pPr>
-              <w:pStyle w:val="Normal"/>
-              <w:spacing w:lineRule="auto" w:line="262" w:before="0" w:after="0"/>
-              <w:rPr/>
-            </w:pPr>
-            <w:r>
-              <w:rPr>
-                <w:rFonts w:eastAsia="Arial" w:cs="Arial"/>
-                <w:b w:val="false"/>
-                <w:bCs w:val="false"/>
-                <w:sz w:val="21"/>
-                <w:szCs w:val="21"/>
-              </w:rPr>
-              <w:t>Expediente del estudiante</w:t>
-            </w:r>
-          </w:p>
-        </w:tc>
-        <w:tc>
-          <w:tcPr>
-            <w:tcW w:w="2552" w:type="dxa"/>
-            <w:tcBorders>
-              <w:top w:val="single" w:sz="4" w:space="0" w:color="C9D3E3"/>
-              <w:start w:val="single" w:sz="4" w:space="0" w:color="C9D3E3"/>
-              <w:bottom w:val="single" w:sz="4" w:space="0" w:color="C9D3E3"/>
-              <w:end w:val="single" w:sz="4" w:space="0" w:color="C9D3E3"/>
-            </w:tcBorders>
-          </w:tcPr>
-          <w:p>
-            <w:pPr>
-              <w:pStyle w:val="Normal"/>
-              <w:spacing w:lineRule="auto" w:line="262" w:before="0" w:after="0"/>
-              <w:rPr/>
-            </w:pPr>
-            <w:r>
-              <w:rPr>
-                <w:rFonts w:eastAsia="Arial" w:cs="Arial"/>
-                <w:b w:val="false"/>
-                <w:bCs w:val="false"/>
-                <w:sz w:val="21"/>
-                <w:szCs w:val="21"/>
-              </w:rPr>
-              <w:t>Volver a Estudiantes</w:t>
-            </w:r>
-          </w:p>
-        </w:tc>
-        <w:tc>
-          <w:tcPr>
-            <w:tcW w:w="3738" w:type="dxa"/>
-            <w:tcBorders>
-              <w:top w:val="single" w:sz="4" w:space="0" w:color="C9D3E3"/>
-              <w:start w:val="single" w:sz="4" w:space="0" w:color="C9D3E3"/>
-              <w:bottom w:val="single" w:sz="4" w:space="0" w:color="C9D3E3"/>
-              <w:end w:val="single" w:sz="4" w:space="0" w:color="C9D3E3"/>
-            </w:tcBorders>
-          </w:tcPr>
-          <w:p>
-            <w:pPr>
-              <w:pStyle w:val="Normal"/>
-              <w:spacing w:lineRule="auto" w:line="262" w:before="0" w:after="0"/>
-              <w:rPr/>
-            </w:pPr>
-            <w:r>
-              <w:rPr>
-                <w:rFonts w:eastAsia="Arial" w:cs="Arial"/>
-                <w:b w:val="false"/>
-                <w:bCs w:val="false"/>
-                <w:sz w:val="21"/>
-                <w:szCs w:val="21"/>
-              </w:rPr>
-              <w:t>Estudiantes</w:t>
-            </w:r>
-          </w:p>
-        </w:tc>
-      </w:tr>
-    </w:tbl>
-    <w:p>
-      <w:pPr>
-        <w:pStyle w:val="Normal"/>
-        <w:spacing w:before="0" w:after="60"/>
-        <w:rPr/>
-      </w:pPr>
-      <w:r>
-        <w:rPr/>
-      </w:r>
-    </w:p>
-    <w:p>
-      <w:pPr>
-        <w:pStyle w:val="Heading1"/>
-        <w:spacing w:before="360" w:after="160"/>
-        <w:rPr/>
-      </w:pPr>
-      <w:r>
-        <w:rPr>
-          <w:rFonts w:eastAsia="Arial" w:cs="Arial"/>
-        </w:rPr>
-        <w:t>8. Datos de ejemplo y comportamientos simulados</w:t>
-      </w:r>
-    </w:p>
-    <w:p>
-      <w:pPr>
-        <w:pStyle w:val="ListParagraph"/>
-        <w:numPr>
-          <w:ilvl w:val="0"/>
-          <w:numId w:val="3"/>
-        </w:numPr>
-        <w:spacing w:lineRule="auto" w:line="360" w:before="0" w:after="120"/>
-        <w:jc w:val="both"/>
-        <w:rPr/>
-      </w:pPr>
-      <w:r>
-        <w:rPr>
-          <w:rFonts w:eastAsia="Arial" w:cs="Arial"/>
-        </w:rPr>
-        <w:t>Todos los nombres, matrículas, promedios, porcentajes y fechas son ficticios.</w:t>
-      </w:r>
-    </w:p>
-    <w:p>
-      <w:pPr>
-        <w:pStyle w:val="ListParagraph"/>
-        <w:numPr>
-          <w:ilvl w:val="0"/>
-          <w:numId w:val="3"/>
-        </w:numPr>
-        <w:spacing w:lineRule="auto" w:line="360" w:before="0" w:after="120"/>
-        <w:jc w:val="both"/>
-        <w:rPr/>
-      </w:pPr>
-      <w:r>
-        <w:rPr>
-          <w:rFonts w:eastAsia="Arial" w:cs="Arial"/>
-        </w:rPr>
-        <w:t>Las cifras no son necesariamente consistentes entre pantallas. Por ejemplo, el promedio y la asistencia de un mismo grupo pueden variar entre Mis Grupos y el detalle del grupo.</w:t>
-      </w:r>
-    </w:p>
-    <w:p>
-      <w:pPr>
-        <w:pStyle w:val="ListParagraph"/>
-        <w:numPr>
-          <w:ilvl w:val="0"/>
-          <w:numId w:val="3"/>
-        </w:numPr>
-        <w:spacing w:lineRule="auto" w:line="360" w:before="0" w:after="120"/>
-        <w:jc w:val="both"/>
-        <w:rPr/>
-      </w:pPr>
-      <w:r>
-        <w:rPr>
-          <w:rFonts w:eastAsia="Arial" w:cs="Arial"/>
-        </w:rPr>
-        <w:t>Los indicadores de asistencia, faltas, reprobadas y bajas se incluyeron como ejemplo. Falta confirmar si el sistema contará con esa información y de qué fuente.</w:t>
-      </w:r>
-    </w:p>
-    <w:p>
-      <w:pPr>
-        <w:pStyle w:val="ListParagraph"/>
-        <w:numPr>
-          <w:ilvl w:val="0"/>
-          <w:numId w:val="3"/>
-        </w:numPr>
-        <w:spacing w:lineRule="auto" w:line="360" w:before="0" w:after="120"/>
-        <w:jc w:val="both"/>
-        <w:rPr/>
-      </w:pPr>
-      <w:r>
-        <w:rPr>
-          <w:rFonts w:eastAsia="Arial" w:cs="Arial"/>
-        </w:rPr>
-        <w:t>Los criterios que marcan a un estudiante como “requiere atención” son supuestos que deben definirse con la Coordinación.</w:t>
-      </w:r>
-    </w:p>
-    <w:p>
-      <w:pPr>
-        <w:pStyle w:val="ListParagraph"/>
-        <w:numPr>
-          <w:ilvl w:val="0"/>
-          <w:numId w:val="3"/>
-        </w:numPr>
-        <w:spacing w:lineRule="auto" w:line="360" w:before="0" w:after="120"/>
-        <w:jc w:val="both"/>
-        <w:rPr/>
-      </w:pPr>
-      <w:r>
-        <w:rPr>
-          <w:rFonts w:eastAsia="Arial" w:cs="Arial"/>
-        </w:rPr>
-        <w:t>Las observaciones nuevas se muestran al guardarlas, pero no se conservan al recargar la página.</w:t>
-      </w:r>
-    </w:p>
-    <w:p>
-      <w:pPr>
-        <w:pStyle w:val="Heading1"/>
-        <w:spacing w:before="360" w:after="160"/>
-        <w:rPr/>
-      </w:pPr>
-      <w:r>
-        <w:rPr>
-          <w:rFonts w:eastAsia="Arial" w:cs="Arial"/>
-        </w:rPr>
-        <w:t>9. Estructura técnica</w:t>
-      </w:r>
-    </w:p>
-    <w:p>
-      <w:pPr>
-        <w:pStyle w:val="Normal"/>
-        <w:keepNext w:val="false"/>
-        <w:spacing w:lineRule="auto" w:line="360" w:before="0" w:after="160"/>
-        <w:jc w:val="both"/>
-        <w:rPr/>
-      </w:pPr>
-      <w:r>
-        <w:rPr>
-          <w:rFonts w:eastAsia="Arial" w:cs="Arial"/>
-        </w:rPr>
-        <w:t>El prototipo usa HTML5, CSS y JavaScript sin frameworks ni servidor. Los estilos y scripts compartidos están separados por archivo para reutilizarlos en las demás pantallas.</w:t>
-      </w:r>
-    </w:p>
-    <w:tbl>
-      <w:tblPr>
-        <w:tblW w:w="8838" w:type="dxa"/>
-        <w:jc w:val="start"/>
-        <w:tblInd w:w="0" w:type="dxa"/>
-        <w:tblLayout w:type="fixed"/>
-        <w:tblCellMar>
-          <w:top w:w="70" w:type="dxa"/>
-          <w:start w:w="110" w:type="dxa"/>
-          <w:bottom w:w="70" w:type="dxa"/>
-          <w:end w:w="110" w:type="dxa"/>
-        </w:tblCellMar>
-      </w:tblPr>
-      <w:tblGrid>
-        <w:gridCol w:w="4153"/>
-        <w:gridCol w:w="4685"/>
-      </w:tblGrid>
-      <w:tr>
-        <w:trPr>
-          <w:tblHeader w:val="true"/>
-          <w:cantSplit/>
-        </w:trPr>
-        <w:tc>
-          <w:tcPr>
-            <w:tcW w:w="4153" w:type="dxa"/>
+            <w:tcW w:w="4152" w:type="dxa"/>
             <w:tcBorders>
               <w:top w:val="single" w:sz="4" w:space="0" w:color="C9D3E3"/>
               <w:start w:val="single" w:sz="4" w:space="0" w:color="C9D3E3"/>
@@ -5228,7 +2578,7 @@
         </w:tc>
         <w:tc>
           <w:tcPr>
-            <w:tcW w:w="4685" w:type="dxa"/>
+            <w:tcW w:w="4686" w:type="dxa"/>
             <w:tcBorders>
               <w:top w:val="single" w:sz="4" w:space="0" w:color="C9D3E3"/>
               <w:start w:val="single" w:sz="4" w:space="0" w:color="C9D3E3"/>
@@ -5262,7 +2612,7 @@
         </w:trPr>
         <w:tc>
           <w:tcPr>
-            <w:tcW w:w="4153" w:type="dxa"/>
+            <w:tcW w:w="4152" w:type="dxa"/>
             <w:tcBorders>
               <w:top w:val="single" w:sz="4" w:space="0" w:color="C9D3E3"/>
               <w:start w:val="single" w:sz="4" w:space="0" w:color="C9D3E3"/>
@@ -5290,7 +2640,7 @@
         </w:tc>
         <w:tc>
           <w:tcPr>
-            <w:tcW w:w="4685" w:type="dxa"/>
+            <w:tcW w:w="4686" w:type="dxa"/>
             <w:tcBorders>
               <w:top w:val="single" w:sz="4" w:space="0" w:color="C9D3E3"/>
               <w:start w:val="single" w:sz="4" w:space="0" w:color="C9D3E3"/>
@@ -5323,7 +2673,7 @@
         </w:trPr>
         <w:tc>
           <w:tcPr>
-            <w:tcW w:w="4153" w:type="dxa"/>
+            <w:tcW w:w="4152" w:type="dxa"/>
             <w:tcBorders>
               <w:top w:val="single" w:sz="4" w:space="0" w:color="C9D3E3"/>
               <w:start w:val="single" w:sz="4" w:space="0" w:color="C9D3E3"/>
@@ -5351,7 +2701,7 @@
         </w:tc>
         <w:tc>
           <w:tcPr>
-            <w:tcW w:w="4685" w:type="dxa"/>
+            <w:tcW w:w="4686" w:type="dxa"/>
             <w:tcBorders>
               <w:top w:val="single" w:sz="4" w:space="0" w:color="C9D3E3"/>
               <w:start w:val="single" w:sz="4" w:space="0" w:color="C9D3E3"/>
@@ -5384,7 +2734,7 @@
         </w:trPr>
         <w:tc>
           <w:tcPr>
-            <w:tcW w:w="4153" w:type="dxa"/>
+            <w:tcW w:w="4152" w:type="dxa"/>
             <w:tcBorders>
               <w:top w:val="single" w:sz="4" w:space="0" w:color="C9D3E3"/>
               <w:start w:val="single" w:sz="4" w:space="0" w:color="C9D3E3"/>
@@ -5412,7 +2762,7 @@
         </w:tc>
         <w:tc>
           <w:tcPr>
-            <w:tcW w:w="4685" w:type="dxa"/>
+            <w:tcW w:w="4686" w:type="dxa"/>
             <w:tcBorders>
               <w:top w:val="single" w:sz="4" w:space="0" w:color="C9D3E3"/>
               <w:start w:val="single" w:sz="4" w:space="0" w:color="C9D3E3"/>
@@ -5445,7 +2795,7 @@
         </w:trPr>
         <w:tc>
           <w:tcPr>
-            <w:tcW w:w="4153" w:type="dxa"/>
+            <w:tcW w:w="4152" w:type="dxa"/>
             <w:tcBorders>
               <w:top w:val="single" w:sz="4" w:space="0" w:color="C9D3E3"/>
               <w:start w:val="single" w:sz="4" w:space="0" w:color="C9D3E3"/>
@@ -5473,7 +2823,7 @@
         </w:tc>
         <w:tc>
           <w:tcPr>
-            <w:tcW w:w="4685" w:type="dxa"/>
+            <w:tcW w:w="4686" w:type="dxa"/>
             <w:tcBorders>
               <w:top w:val="single" w:sz="4" w:space="0" w:color="C9D3E3"/>
               <w:start w:val="single" w:sz="4" w:space="0" w:color="C9D3E3"/>
@@ -5506,7 +2856,7 @@
         </w:trPr>
         <w:tc>
           <w:tcPr>
-            <w:tcW w:w="4153" w:type="dxa"/>
+            <w:tcW w:w="4152" w:type="dxa"/>
             <w:tcBorders>
               <w:top w:val="single" w:sz="4" w:space="0" w:color="C9D3E3"/>
               <w:start w:val="single" w:sz="4" w:space="0" w:color="C9D3E3"/>
@@ -5534,7 +2884,7 @@
         </w:tc>
         <w:tc>
           <w:tcPr>
-            <w:tcW w:w="4685" w:type="dxa"/>
+            <w:tcW w:w="4686" w:type="dxa"/>
             <w:tcBorders>
               <w:top w:val="single" w:sz="4" w:space="0" w:color="C9D3E3"/>
               <w:start w:val="single" w:sz="4" w:space="0" w:color="C9D3E3"/>
@@ -5566,33 +2916,12 @@
       <w:pPr>
         <w:pStyle w:val="Normal"/>
         <w:spacing w:before="0" w:after="60"/>
-        <w:rPr/>
-      </w:pPr>
-      <w:r>
-        <w:rPr/>
-      </w:r>
-    </w:p>
-    <w:p>
-      <w:pPr>
-        <w:pStyle w:val="Normal"/>
-        <w:keepNext w:val="false"/>
-        <w:spacing w:lineRule="auto" w:line="360" w:before="0" w:after="160"/>
-        <w:jc w:val="both"/>
-        <w:rPr/>
-      </w:pPr>
-      <w:r>
-        <w:rPr>
-          <w:rFonts w:eastAsia="Arial" w:cs="Arial"/>
-          <w:b/>
-          <w:bCs/>
-        </w:rPr>
-        <w:t xml:space="preserve">Cómo abrirlo: </w:t>
-      </w:r>
-      <w:r>
-        <w:rPr>
-          <w:rFonts w:eastAsia="Arial" w:cs="Arial"/>
-        </w:rPr>
-        <w:t>abrir la carpeta del proyecto en Visual Studio Code, instalar la extensión Live Server y abrir index.html con Live Server. También se puede abrir index.html directamente en el navegador.</w:t>
+        <w:rPr>
+          <w:rFonts w:eastAsia="Arial" w:cs="Arial"/>
+        </w:rPr>
+      </w:pPr>
+      <w:r>
+        <w:rPr/>
       </w:r>
     </w:p>
     <w:p>
@@ -5605,7 +2934,13 @@
         <w:rPr>
           <w:rFonts w:eastAsia="Arial" w:cs="Arial"/>
         </w:rPr>
-        <w:t>10. Puntos a validar con los revisores</w:t>
+        <w:t>6</w:t>
+      </w:r>
+      <w:r>
+        <w:rPr>
+          <w:rFonts w:eastAsia="Arial" w:cs="Arial"/>
+        </w:rPr>
+        <w:t>. Puntos a validar con los revisores</w:t>
       </w:r>
     </w:p>
     <w:p>
@@ -5876,7 +3211,13 @@
         <w:rPr>
           <w:rFonts w:eastAsia="Arial" w:cs="Arial"/>
         </w:rPr>
-        <w:t>11. Siguientes pasos</w:t>
+        <w:t>7</w:t>
+      </w:r>
+      <w:r>
+        <w:rPr>
+          <w:rFonts w:eastAsia="Arial" w:cs="Arial"/>
+        </w:rPr>
+        <w:t>. Siguientes pasos</w:t>
       </w:r>
     </w:p>
     <w:p>
@@ -6097,7 +3438,7 @@
       <w:rPr>
         <w:rFonts w:eastAsia="Arial" w:cs="Arial"/>
       </w:rPr>
-      <w:t>17</w:t>
+      <w:t>14</w:t>
     </w:r>
     <w:r>
       <w:rPr>
@@ -6136,7 +3477,7 @@
       <w:rPr>
         <w:rFonts w:eastAsia="Arial" w:cs="Arial"/>
       </w:rPr>
-      <w:t>17</w:t>
+      <w:t>14</w:t>
     </w:r>
     <w:r>
       <w:rPr>
@@ -6969,8 +4310,8 @@
       <w:u w:val="single"/>
     </w:rPr>
   </w:style>
-  <w:style w:type="character" w:styleId="FootnoteCharactersuser">
-    <w:name w:val="Footnote Characters (user)"/>
+  <w:style w:type="character" w:styleId="FootnoteCharacters">
+    <w:name w:val="Footnote Characters"/>
     <w:uiPriority w:val="99"/>
     <w:semiHidden/>
     <w:unhideWhenUsed/>
@@ -6979,8 +4320,8 @@
       <w:vertAlign w:val="superscript"/>
     </w:rPr>
   </w:style>
-  <w:style w:type="character" w:styleId="FootnoteCharacters">
-    <w:name w:val="Footnote Characters"/>
+  <w:style w:type="character" w:styleId="FootnoteCharactersuser">
+    <w:name w:val="Footnote Characters (user)"/>
     <w:qFormat/>
     <w:rPr>
       <w:vertAlign w:val="superscript"/>
@@ -7004,8 +4345,8 @@
       <w:szCs w:val="20"/>
     </w:rPr>
   </w:style>
-  <w:style w:type="character" w:styleId="EndnoteCharactersuser">
-    <w:name w:val="Endnote Characters (user)"/>
+  <w:style w:type="character" w:styleId="EndnoteCharacters">
+    <w:name w:val="Endnote Characters"/>
     <w:uiPriority w:val="99"/>
     <w:semiHidden/>
     <w:unhideWhenUsed/>
@@ -7014,8 +4355,8 @@
       <w:vertAlign w:val="superscript"/>
     </w:rPr>
   </w:style>
-  <w:style w:type="character" w:styleId="EndnoteCharacters">
-    <w:name w:val="Endnote Characters"/>
+  <w:style w:type="character" w:styleId="EndnoteCharactersuser">
+    <w:name w:val="Endnote Characters (user)"/>
     <w:qFormat/>
     <w:rPr>
       <w:vertAlign w:val="superscript"/>
@@ -7196,6 +4537,13 @@
     <w:pPr/>
     <w:rPr/>
   </w:style>
+  <w:style w:type="paragraph" w:styleId="FrameContentsuser">
+    <w:name w:val="Frame Contents (user)"/>
+    <w:basedOn w:val="Normal"/>
+    <w:qFormat/>
+    <w:pPr/>
+    <w:rPr/>
+  </w:style>
   <w:style w:type="paragraph" w:styleId="FrameContents">
     <w:name w:val="Frame Contents"/>
     <w:basedOn w:val="Normal"/>

</xml_diff>